<commit_message>
- Added: docs/database/schema.sql - Modified: README.md
</commit_message>
<xml_diff>
--- a/docs/Documentation.docx
+++ b/docs/Documentation.docx
@@ -1526,16 +1526,22 @@
     </w:p>
     <w:p>
       <w:r>
-        <w:t xml:space="preserve">Rozhodli sme sa </w:t>
-      </w:r>
-      <w:r>
-        <w:t>pre vývoj</w:t>
+        <w:t xml:space="preserve">Rozhodli sme sa pre vývoj </w:t>
+      </w:r>
+      <w:r>
+        <w:t>sofvérového riešenia desktopovej kryptopeňaženky</w:t>
       </w:r>
       <w:r>
         <w:t xml:space="preserve"> </w:t>
       </w:r>
       <w:r>
-        <w:t>sofvérového riešenia desktopovej kryptopeňaženky s cieľom rozvíjať zručnosti vo vývoji bezpečných aplikácií, kryptografii a spoľahlivom spracovaní citlivých dát</w:t>
+        <w:t>s</w:t>
+      </w:r>
+      <w:r>
+        <w:t> </w:t>
+      </w:r>
+      <w:r>
+        <w:t>cieľom rozvíjať zručnosti vo vývoji bezpečných aplikácií, kryptografii a spoľahlivom spracovaní citlivých dát</w:t>
       </w:r>
       <w:r>
         <w:t xml:space="preserve">. </w:t>
@@ -1546,7 +1552,19 @@
     </w:p>
     <w:p>
       <w:r>
-        <w:t xml:space="preserve">Práca pozostávala z klienta a backendového API serveru. Pri návrhu sme sa sústredili na bezpečnosť a spoľahlivosť, využívajúc moderné šifrovacie mechanizmy a osvedčené postupy ochrany </w:t>
+        <w:t>Práca pozostávala z klienta a backendového API serveru. Pri návrhu sme sa</w:t>
+      </w:r>
+      <w:r>
+        <w:t> </w:t>
+      </w:r>
+      <w:r>
+        <w:t>sústredili na bezpečnosť a spoľahlivosť, využívajúc moderné šifrovacie mechanizmy a</w:t>
+      </w:r>
+      <w:r>
+        <w:t xml:space="preserve"> </w:t>
+      </w:r>
+      <w:r>
+        <w:t xml:space="preserve">osvedčené postupy ochrany </w:t>
       </w:r>
       <w:r>
         <w:t>citlivých informácií</w:t>
@@ -1555,7 +1573,13 @@
         <w:t xml:space="preserve">. </w:t>
       </w:r>
       <w:r>
-        <w:t>Rovnako sme sa zamerali na spoľahlivosť, stabilitu a efektívnosť, aby aplikácia stabilne a konzistentne vykonávala všetky operácie.</w:t>
+        <w:t>Rovnako sme sa zamerali na</w:t>
+      </w:r>
+      <w:r>
+        <w:t> </w:t>
+      </w:r>
+      <w:r>
+        <w:t>spoľahlivosť, stabilitu a efektívnosť, aby aplikácia stabilne a konzistentne vykonávala všetky operácie.</w:t>
       </w:r>
     </w:p>
     <w:p>
@@ -1563,45 +1587,54 @@
         <w:t>Používateľské rozhranie bolo navrhnuté s ohľadom na intuitívnosť, prehľadnosť a jednoduchosť, čím sme zjednodušili používanie aplikácie aj pre menej skúsených používateľov.</w:t>
       </w:r>
       <w:r>
+        <w:t xml:space="preserve"> Projekt bol verzovaný a </w:t>
+      </w:r>
+      <w:r>
+        <w:t>spravovaný</w:t>
+      </w:r>
+      <w:r>
+        <w:t xml:space="preserve"> prostredníctvom Git-u, čo umožnilo </w:t>
+      </w:r>
+      <w:r>
+        <w:t xml:space="preserve">efektívne </w:t>
+      </w:r>
+      <w:r>
+        <w:t xml:space="preserve">sledovanie zmien, prácu s viacerými </w:t>
+      </w:r>
+      <w:r>
+        <w:t>vývojovými</w:t>
+      </w:r>
+      <w:r>
+        <w:t xml:space="preserve"> vetvami a bezpečné nasadzovanie </w:t>
+      </w:r>
+      <w:r>
+        <w:t xml:space="preserve">nových </w:t>
+      </w:r>
+      <w:r>
+        <w:t>funkcií.</w:t>
+      </w:r>
+    </w:p>
+    <w:p>
+      <w:r>
+        <w:t xml:space="preserve">Dokumentácia podrobne opisuje architektúru systému, implementované funkcie, bezpečnostné opatrenia a postupy, ktoré </w:t>
+      </w:r>
+      <w:r>
+        <w:t>zabezpečujú</w:t>
+      </w:r>
+      <w:r>
+        <w:t xml:space="preserve"> bezpečný a efektívny chod systému,</w:t>
+      </w:r>
+      <w:r>
         <w:t xml:space="preserve"> </w:t>
       </w:r>
       <w:r>
-        <w:t>Projekt bol verzovaný</w:t>
-      </w:r>
-      <w:r>
-        <w:t xml:space="preserve"> a </w:t>
-      </w:r>
-      <w:r>
-        <w:t>spravovaný</w:t>
-      </w:r>
-      <w:r>
-        <w:t xml:space="preserve"> prostredníctvom Git-u, čo umožnilo </w:t>
-      </w:r>
-      <w:r>
-        <w:t xml:space="preserve">efektívne </w:t>
-      </w:r>
-      <w:r>
-        <w:t xml:space="preserve">sledovanie zmien, prácu s viacerými </w:t>
-      </w:r>
-      <w:r>
-        <w:t>vývojovými</w:t>
-      </w:r>
-      <w:r>
-        <w:t xml:space="preserve"> </w:t>
-      </w:r>
-      <w:r>
-        <w:t xml:space="preserve">vetvami a bezpečné nasadzovanie </w:t>
-      </w:r>
-      <w:r>
-        <w:t xml:space="preserve">nových </w:t>
-      </w:r>
-      <w:r>
-        <w:t>funkcií.</w:t>
-      </w:r>
-    </w:p>
-    <w:p>
-      <w:r>
-        <w:t>Dokumentácia podrobne opisuje architektúru systému, implementované funkcie, bezpečnostné opatrenia a postupy, ktoré zabezpečovali bezpečný a efektívny chod systému, vrátane odporúčaných postupov pri nasadení a údržbe softvérového riešenia v reálnom prostredí.</w:t>
+        <w:t>vrátane odporúčaných postupov pri nasadení a údržbe softvérového riešenia v</w:t>
+      </w:r>
+      <w:r>
+        <w:t> </w:t>
+      </w:r>
+      <w:r>
+        <w:t>reálnom prostredí.</w:t>
       </w:r>
       <w:r>
         <w:br w:type="page"/>
@@ -1638,6 +1671,7 @@
           <w:id w:val="-311638208"/>
           <w:citation/>
         </w:sdtPr>
+        <w:sdtEndPr/>
         <w:sdtContent>
           <w:r>
             <w:fldChar w:fldCharType="begin"/>
@@ -1678,6 +1712,7 @@
           <w:id w:val="1043022850"/>
           <w:citation/>
         </w:sdtPr>
+        <w:sdtEndPr/>
         <w:sdtContent>
           <w:r>
             <w:fldChar w:fldCharType="begin"/>
@@ -1729,6 +1764,7 @@
           <w:id w:val="1084189129"/>
           <w:citation/>
         </w:sdtPr>
+        <w:sdtEndPr/>
         <w:sdtContent>
           <w:r>
             <w:fldChar w:fldCharType="begin"/>
@@ -1780,6 +1816,7 @@
           <w:id w:val="667224303"/>
           <w:citation/>
         </w:sdtPr>
+        <w:sdtEndPr/>
         <w:sdtContent>
           <w:r>
             <w:fldChar w:fldCharType="begin"/>
@@ -1827,6 +1864,7 @@
           <w:id w:val="596214018"/>
           <w:citation/>
         </w:sdtPr>
+        <w:sdtEndPr/>
         <w:sdtContent>
           <w:r>
             <w:fldChar w:fldCharType="begin"/>
@@ -1874,6 +1912,7 @@
           <w:id w:val="1364783891"/>
           <w:citation/>
         </w:sdtPr>
+        <w:sdtEndPr/>
         <w:sdtContent>
           <w:r>
             <w:fldChar w:fldCharType="begin"/>
@@ -1931,6 +1970,7 @@
           <w:id w:val="-1122455265"/>
           <w:citation/>
         </w:sdtPr>
+        <w:sdtEndPr/>
         <w:sdtContent>
           <w:r>
             <w:fldChar w:fldCharType="begin"/>
@@ -1978,6 +2018,7 @@
           <w:id w:val="1667203991"/>
           <w:citation/>
         </w:sdtPr>
+        <w:sdtEndPr/>
         <w:sdtContent>
           <w:r>
             <w:fldChar w:fldCharType="begin"/>
@@ -2036,6 +2077,7 @@
           <w:id w:val="1509013995"/>
           <w:citation/>
         </w:sdtPr>
+        <w:sdtEndPr/>
         <w:sdtContent>
           <w:r>
             <w:fldChar w:fldCharType="begin"/>
@@ -2115,7 +2157,13 @@
         <w:ind w:firstLine="432"/>
       </w:pPr>
       <w:r>
-        <w:t>Dôležitou súčasťou bolo zabezpečenie bezpečného ukladania a ochrany citlivých údajov, vrátane privátnych kľúčov a seed fráz, a implementácia funkcionalít umožňujúcich realizáciu kryptomenových transakcií s prehľadným zobrazením ich histórie. Rovnako bol kladený dôraz na vytvorenie prehľadného a intuitívneho používateľského rozhrania, ktoré uľahčuje správu účtu, transakcií a bezpečnostných nastavení.</w:t>
+        <w:t xml:space="preserve">Dôležitou súčasťou bolo </w:t>
+      </w:r>
+      <w:r>
+        <w:t>zaistenie</w:t>
+      </w:r>
+      <w:r>
+        <w:t xml:space="preserve"> bezpečného ukladania a ochrany citlivých údajov, vrátane privátnych kľúčov a seed fráz, a implementácia funkcionalít umožňujúcich realizáciu kryptomenových transakcií s prehľadným zobrazením ich histórie. Rovnako bol kladený dôraz na vytvorenie prehľadného a intuitívneho používateľského rozhrania, ktoré uľahčuje správu účtu, transakcií a bezpečnostných nastavení.</w:t>
       </w:r>
     </w:p>
     <w:p>

</xml_diff>

<commit_message>
- Added: WalletSelectionView.axaml - Added: RecoveryPhraseImportView.axaml and RecoveryPhraseView.axaml - Added: ActivityLogEntity.cs - Added: ActivityLogRepository.cs - Added: ActivityActorType.cs - Added: Static API Url ('unicorn-casual-yeti.ngrok-free.app') - Replaced: UserNotFoundException.cs with NotFoundException.cs - Replaced: AccessProhibitedException.cs with ForbiddenException.cs - Replaced: TwoFactorAlreadyConfiguredException.cs and TwoFactorNotConfiguredException.cs with TwoFactorConfigurationException.cs - Modified: DeviceContextProvider.cs
</commit_message>
<xml_diff>
--- a/docs/Documentation.docx
+++ b/docs/Documentation.docx
@@ -442,6 +442,7 @@
           <w14:ligatures w14:val="none"/>
         </w:rPr>
         <w:sectPr>
+          <w:footerReference w:type="default" r:id="rId9"/>
           <w:pgSz w:w="11906" w:h="16838"/>
           <w:pgMar w:top="1418" w:right="1418" w:bottom="1418" w:left="1418" w:header="709" w:footer="709" w:gutter="0"/>
           <w:cols w:space="708"/>
@@ -1175,7 +1176,16 @@
           <w:szCs w:val="28"/>
           <w14:ligatures w14:val="none"/>
         </w:rPr>
-        <w:t>. 10. 2022</w:t>
+        <w:t>. 10. 202</w:t>
+      </w:r>
+      <w:r>
+        <w:rPr>
+          <w:rFonts w:eastAsia="Calibri" w:cs="Times New Roman"/>
+          <w:kern w:val="0"/>
+          <w:szCs w:val="28"/>
+          <w14:ligatures w14:val="none"/>
+        </w:rPr>
+        <w:t>6</w:t>
       </w:r>
     </w:p>
     <w:p>
@@ -1517,6 +1527,599 @@
           <w:ilvl w:val="0"/>
           <w:numId w:val="0"/>
         </w:numPr>
+      </w:pPr>
+      <w:r>
+        <w:lastRenderedPageBreak/>
+        <w:t>ZOZNAM SKRATIEK, ZNAČIEK a</w:t>
+      </w:r>
+      <w:r>
+        <w:t> </w:t>
+      </w:r>
+      <w:r>
+        <w:t>SYMBOLOV</w:t>
+      </w:r>
+    </w:p>
+    <w:p>
+      <w:pPr>
+        <w:ind w:firstLine="432"/>
+      </w:pPr>
+      <w:r>
+        <w:t>AES</w:t>
+      </w:r>
+      <w:r>
+        <w:tab/>
+      </w:r>
+      <w:r>
+        <w:t>Advanced Encryption Standard</w:t>
+      </w:r>
+    </w:p>
+    <w:p>
+      <w:pPr>
+        <w:ind w:firstLine="432"/>
+      </w:pPr>
+      <w:r>
+        <w:t>API</w:t>
+      </w:r>
+      <w:r>
+        <w:tab/>
+      </w:r>
+      <w:r>
+        <w:t>Application Programming Interface</w:t>
+      </w:r>
+    </w:p>
+    <w:p>
+      <w:pPr>
+        <w:ind w:firstLine="432"/>
+      </w:pPr>
+      <w:r>
+        <w:t>ASP</w:t>
+      </w:r>
+      <w:r>
+        <w:tab/>
+      </w:r>
+      <w:r>
+        <w:t>Active Server Pages</w:t>
+      </w:r>
+    </w:p>
+    <w:p>
+      <w:pPr>
+        <w:ind w:firstLine="432"/>
+      </w:pPr>
+      <w:r>
+        <w:t>DB</w:t>
+      </w:r>
+      <w:r>
+        <w:tab/>
+        <w:t>Database</w:t>
+      </w:r>
+    </w:p>
+    <w:p>
+      <w:pPr>
+        <w:ind w:firstLine="432"/>
+      </w:pPr>
+      <w:r>
+        <w:t>GC</w:t>
+      </w:r>
+      <w:r>
+        <w:tab/>
+      </w:r>
+      <w:r>
+        <w:t>Garbage Collection</w:t>
+      </w:r>
+    </w:p>
+    <w:p>
+      <w:pPr>
+        <w:ind w:firstLine="432"/>
+      </w:pPr>
+      <w:r>
+        <w:t>HMAC</w:t>
+      </w:r>
+      <w:r>
+        <w:tab/>
+        <w:t>Hash-based Message Authentication Code</w:t>
+      </w:r>
+    </w:p>
+    <w:p>
+      <w:pPr>
+        <w:ind w:firstLine="432"/>
+      </w:pPr>
+      <w:r>
+        <w:t>HTTP</w:t>
+      </w:r>
+      <w:r>
+        <w:tab/>
+      </w:r>
+      <w:r>
+        <w:t>HyperText Transfer Protocol</w:t>
+      </w:r>
+    </w:p>
+    <w:p>
+      <w:pPr>
+        <w:ind w:firstLine="432"/>
+      </w:pPr>
+      <w:r>
+        <w:t>HTTPS</w:t>
+      </w:r>
+      <w:r>
+        <w:tab/>
+      </w:r>
+      <w:r>
+        <w:t>HyperText Transfer Protocol Secure</w:t>
+      </w:r>
+    </w:p>
+    <w:p>
+      <w:pPr>
+        <w:ind w:firstLine="432"/>
+      </w:pPr>
+      <w:r>
+        <w:t>IP</w:t>
+      </w:r>
+      <w:r>
+        <w:tab/>
+      </w:r>
+      <w:r>
+        <w:tab/>
+      </w:r>
+      <w:r>
+        <w:t>Internet Protocol</w:t>
+      </w:r>
+    </w:p>
+    <w:p>
+      <w:pPr>
+        <w:ind w:firstLine="432"/>
+      </w:pPr>
+      <w:r>
+        <w:t>JWT</w:t>
+      </w:r>
+      <w:r>
+        <w:tab/>
+      </w:r>
+      <w:r>
+        <w:t>JSON Web Token</w:t>
+      </w:r>
+    </w:p>
+    <w:p>
+      <w:pPr>
+        <w:ind w:firstLine="432"/>
+      </w:pPr>
+      <w:r>
+        <w:t>JSON</w:t>
+      </w:r>
+      <w:r>
+        <w:tab/>
+      </w:r>
+      <w:r>
+        <w:t>JavaScript Object Notation</w:t>
+      </w:r>
+    </w:p>
+    <w:p>
+      <w:pPr>
+        <w:ind w:firstLine="432"/>
+      </w:pPr>
+      <w:r>
+        <w:t>OAuth</w:t>
+      </w:r>
+      <w:r>
+        <w:tab/>
+      </w:r>
+      <w:r>
+        <w:t>Open Authorization</w:t>
+      </w:r>
+    </w:p>
+    <w:p>
+      <w:pPr>
+        <w:ind w:firstLine="432"/>
+      </w:pPr>
+      <w:r>
+        <w:t>OS</w:t>
+      </w:r>
+      <w:r>
+        <w:tab/>
+      </w:r>
+      <w:r>
+        <w:t>Operating System</w:t>
+      </w:r>
+    </w:p>
+    <w:p>
+      <w:pPr>
+        <w:ind w:firstLine="432"/>
+      </w:pPr>
+      <w:r>
+        <w:t>REST</w:t>
+      </w:r>
+      <w:r>
+        <w:tab/>
+      </w:r>
+      <w:r>
+        <w:t xml:space="preserve">Representational State Transfer </w:t>
+      </w:r>
+    </w:p>
+    <w:p>
+      <w:pPr>
+        <w:ind w:firstLine="432"/>
+      </w:pPr>
+      <w:r>
+        <w:t>RSA</w:t>
+      </w:r>
+      <w:r>
+        <w:tab/>
+      </w:r>
+      <w:r>
+        <w:t>Rivest–Shamir–Adleman</w:t>
+      </w:r>
+    </w:p>
+    <w:p>
+      <w:pPr>
+        <w:ind w:firstLine="432"/>
+      </w:pPr>
+      <w:r>
+        <w:t>SHA</w:t>
+      </w:r>
+      <w:r>
+        <w:tab/>
+      </w:r>
+      <w:r>
+        <w:t>Secure Hash Algorithm</w:t>
+      </w:r>
+    </w:p>
+    <w:p>
+      <w:pPr>
+        <w:ind w:firstLine="432"/>
+      </w:pPr>
+      <w:r>
+        <w:t>SQL</w:t>
+      </w:r>
+      <w:r>
+        <w:tab/>
+      </w:r>
+      <w:r>
+        <w:t>Structured Query Language</w:t>
+      </w:r>
+    </w:p>
+    <w:p>
+      <w:pPr>
+        <w:ind w:firstLine="432"/>
+      </w:pPr>
+      <w:r>
+        <w:t>TO</w:t>
+      </w:r>
+      <w:r>
+        <w:t>TP</w:t>
+      </w:r>
+      <w:r>
+        <w:tab/>
+      </w:r>
+      <w:r>
+        <w:t xml:space="preserve">Time-based </w:t>
+      </w:r>
+      <w:r>
+        <w:t>O</w:t>
+      </w:r>
+      <w:r>
+        <w:t>ne</w:t>
+      </w:r>
+      <w:r>
+        <w:t xml:space="preserve"> T</w:t>
+      </w:r>
+      <w:r>
+        <w:t xml:space="preserve">ime </w:t>
+      </w:r>
+      <w:r>
+        <w:t>P</w:t>
+      </w:r>
+      <w:r>
+        <w:t>assword</w:t>
+      </w:r>
+    </w:p>
+    <w:p>
+      <w:pPr>
+        <w:ind w:firstLine="432"/>
+      </w:pPr>
+      <w:r>
+        <w:t>UI</w:t>
+      </w:r>
+      <w:r>
+        <w:tab/>
+      </w:r>
+      <w:r>
+        <w:tab/>
+      </w:r>
+      <w:r>
+        <w:t>User Interface</w:t>
+      </w:r>
+    </w:p>
+    <w:p>
+      <w:pPr>
+        <w:ind w:firstLine="432"/>
+      </w:pPr>
+      <w:r>
+        <w:t>URI</w:t>
+      </w:r>
+      <w:r>
+        <w:tab/>
+      </w:r>
+      <w:r>
+        <w:t>Uniform Resource Identifier</w:t>
+      </w:r>
+    </w:p>
+    <w:p>
+      <w:pPr>
+        <w:ind w:firstLine="432"/>
+      </w:pPr>
+      <w:r>
+        <w:t>2FA</w:t>
+      </w:r>
+      <w:r>
+        <w:tab/>
+      </w:r>
+      <w:r>
+        <w:t>Two-Factor Authentication</w:t>
+      </w:r>
+    </w:p>
+    <w:p>
+      <w:pPr>
+        <w:ind w:firstLine="0"/>
+      </w:pPr>
+      <w:r>
+        <w:br w:type="page"/>
+      </w:r>
+    </w:p>
+    <w:p>
+      <w:pPr>
+        <w:pStyle w:val="Heading1"/>
+        <w:numPr>
+          <w:ilvl w:val="0"/>
+          <w:numId w:val="0"/>
+        </w:numPr>
+      </w:pPr>
+      <w:r>
+        <w:lastRenderedPageBreak/>
+        <w:t>ZOZNAM OBRÁZKOV, TABULIEK a</w:t>
+      </w:r>
+      <w:r>
+        <w:t> </w:t>
+      </w:r>
+      <w:r>
+        <w:t>GRAFOV</w:t>
+      </w:r>
+    </w:p>
+    <w:p>
+      <w:pPr>
+        <w:pStyle w:val="TableofFigures"/>
+        <w:tabs>
+          <w:tab w:val="right" w:leader="dot" w:pos="8493"/>
+        </w:tabs>
+        <w:rPr>
+          <w:noProof/>
+        </w:rPr>
+      </w:pPr>
+      <w:r>
+        <w:fldChar w:fldCharType="begin"/>
+      </w:r>
+      <w:r>
+        <w:instrText xml:space="preserve"> TOC \h \z \c "Obrázok" </w:instrText>
+      </w:r>
+      <w:r>
+        <w:fldChar w:fldCharType="separate"/>
+      </w:r>
+      <w:hyperlink r:id="rId10" w:anchor="_Toc221475776" w:history="1">
+        <w:r>
+          <w:rPr>
+            <w:rStyle w:val="Hyperlink"/>
+            <w:noProof/>
+          </w:rPr>
+          <w:t>Obrázok 1 Sekvenčný diagram autorizačného toku OAuth 2.0</w:t>
+        </w:r>
+        <w:r>
+          <w:rPr>
+            <w:noProof/>
+            <w:webHidden/>
+          </w:rPr>
+          <w:tab/>
+        </w:r>
+        <w:r>
+          <w:rPr>
+            <w:noProof/>
+            <w:webHidden/>
+          </w:rPr>
+          <w:fldChar w:fldCharType="begin"/>
+        </w:r>
+        <w:r>
+          <w:rPr>
+            <w:noProof/>
+            <w:webHidden/>
+          </w:rPr>
+          <w:instrText xml:space="preserve"> PAGEREF _Toc221475776 \h </w:instrText>
+        </w:r>
+        <w:r>
+          <w:rPr>
+            <w:noProof/>
+            <w:webHidden/>
+          </w:rPr>
+        </w:r>
+        <w:r>
+          <w:rPr>
+            <w:noProof/>
+            <w:webHidden/>
+          </w:rPr>
+          <w:fldChar w:fldCharType="separate"/>
+        </w:r>
+        <w:r>
+          <w:rPr>
+            <w:noProof/>
+            <w:webHidden/>
+          </w:rPr>
+          <w:t>16</w:t>
+        </w:r>
+        <w:r>
+          <w:rPr>
+            <w:noProof/>
+            <w:webHidden/>
+          </w:rPr>
+          <w:fldChar w:fldCharType="end"/>
+        </w:r>
+      </w:hyperlink>
+    </w:p>
+    <w:p>
+      <w:pPr>
+        <w:pStyle w:val="TableofFigures"/>
+        <w:tabs>
+          <w:tab w:val="right" w:leader="dot" w:pos="8493"/>
+        </w:tabs>
+        <w:rPr>
+          <w:noProof/>
+        </w:rPr>
+      </w:pPr>
+      <w:hyperlink r:id="rId11" w:anchor="_Toc221475777" w:history="1">
+        <w:r>
+          <w:rPr>
+            <w:rStyle w:val="Hyperlink"/>
+            <w:noProof/>
+          </w:rPr>
+          <w:t>Obrázok 2 Lokálne uložený refresh token</w:t>
+        </w:r>
+        <w:r>
+          <w:rPr>
+            <w:noProof/>
+            <w:webHidden/>
+          </w:rPr>
+          <w:tab/>
+        </w:r>
+        <w:r>
+          <w:rPr>
+            <w:noProof/>
+            <w:webHidden/>
+          </w:rPr>
+          <w:fldChar w:fldCharType="begin"/>
+        </w:r>
+        <w:r>
+          <w:rPr>
+            <w:noProof/>
+            <w:webHidden/>
+          </w:rPr>
+          <w:instrText xml:space="preserve"> PAGEREF _Toc221475777 \h </w:instrText>
+        </w:r>
+        <w:r>
+          <w:rPr>
+            <w:noProof/>
+            <w:webHidden/>
+          </w:rPr>
+        </w:r>
+        <w:r>
+          <w:rPr>
+            <w:noProof/>
+            <w:webHidden/>
+          </w:rPr>
+          <w:fldChar w:fldCharType="separate"/>
+        </w:r>
+        <w:r>
+          <w:rPr>
+            <w:noProof/>
+            <w:webHidden/>
+          </w:rPr>
+          <w:t>17</w:t>
+        </w:r>
+        <w:r>
+          <w:rPr>
+            <w:noProof/>
+            <w:webHidden/>
+          </w:rPr>
+          <w:fldChar w:fldCharType="end"/>
+        </w:r>
+      </w:hyperlink>
+    </w:p>
+    <w:p>
+      <w:pPr>
+        <w:pStyle w:val="TableofFigures"/>
+        <w:tabs>
+          <w:tab w:val="right" w:leader="dot" w:pos="8493"/>
+        </w:tabs>
+        <w:rPr>
+          <w:noProof/>
+        </w:rPr>
+      </w:pPr>
+      <w:hyperlink r:id="rId12" w:anchor="_Toc221475778" w:history="1">
+        <w:r>
+          <w:rPr>
+            <w:rStyle w:val="Hyperlink"/>
+            <w:noProof/>
+          </w:rPr>
+          <w:t>Obrázok 3 Diagram procesu inicializácie TOTP</w:t>
+        </w:r>
+        <w:r>
+          <w:rPr>
+            <w:noProof/>
+            <w:webHidden/>
+          </w:rPr>
+          <w:tab/>
+        </w:r>
+        <w:r>
+          <w:rPr>
+            <w:noProof/>
+            <w:webHidden/>
+          </w:rPr>
+          <w:fldChar w:fldCharType="begin"/>
+        </w:r>
+        <w:r>
+          <w:rPr>
+            <w:noProof/>
+            <w:webHidden/>
+          </w:rPr>
+          <w:instrText xml:space="preserve"> PAGEREF _Toc221475778 \h </w:instrText>
+        </w:r>
+        <w:r>
+          <w:rPr>
+            <w:noProof/>
+            <w:webHidden/>
+          </w:rPr>
+        </w:r>
+        <w:r>
+          <w:rPr>
+            <w:noProof/>
+            <w:webHidden/>
+          </w:rPr>
+          <w:fldChar w:fldCharType="separate"/>
+        </w:r>
+        <w:r>
+          <w:rPr>
+            <w:noProof/>
+            <w:webHidden/>
+          </w:rPr>
+          <w:t>17</w:t>
+        </w:r>
+        <w:r>
+          <w:rPr>
+            <w:noProof/>
+            <w:webHidden/>
+          </w:rPr>
+          <w:fldChar w:fldCharType="end"/>
+        </w:r>
+      </w:hyperlink>
+    </w:p>
+    <w:p>
+      <w:pPr>
+        <w:ind w:firstLine="0"/>
+        <w:sectPr>
+          <w:pgSz w:w="11906" w:h="16838" w:code="9"/>
+          <w:pgMar w:top="1418" w:right="1418" w:bottom="1418" w:left="1985" w:header="851" w:footer="851" w:gutter="0"/>
+          <w:cols w:space="708"/>
+          <w:docGrid w:linePitch="360"/>
+        </w:sectPr>
+      </w:pPr>
+      <w:r>
+        <w:fldChar w:fldCharType="end"/>
+      </w:r>
+      <w:r>
+        <w:br w:type="page"/>
+      </w:r>
+    </w:p>
+    <w:p>
+      <w:pPr>
+        <w:pStyle w:val="Heading1"/>
+        <w:numPr>
+          <w:ilvl w:val="0"/>
+          <w:numId w:val="0"/>
+        </w:numPr>
         <w:ind w:left="432" w:hanging="432"/>
       </w:pPr>
       <w:r>
@@ -1664,7 +2267,7 @@
     </w:p>
     <w:p>
       <w:r>
-        <w:t>Platforma .NET bola navrhnutá tak, aby poskytovala produktivitu, výkon, bezpečnosť a spoľahlivosť. Poskytuje automatickú správu pamäte prostredníctvom garbage collectoru (GC). Je typovo bezpečná a pamäťovo bezpečná, vďaka používaniu GC a prísnym kompilátorom jazyka. Ponúka konkurentnosť prostredníctvom async/await a Task primitív. Obsahuje veľkú sadu knižníc, ktoré majú širokú funkcionalitu a boli optimalizované pre výkon na viacerých operačných systémoch a architektúrach čipov.</w:t>
+        <w:t>Platforma .NET bola navrhnutá tak, aby poskytovala produktivitu, výkon, bezpečnosť a spoľahlivosť. Poskytuje automatickú správu pamäte prostredníctvom garbage collectoru. Je typovo bezpečná a pamäťovo bezpečná, vďaka používaniu GC a prísnym kompilátorom jazyka. Ponúka konkurentnosť prostredníctvom async/await a Task primitív. Obsahuje veľkú sadu knižníc, ktoré majú širokú funkcionalitu a boli optimalizované pre výkon na viacerých operačných systémoch a architektúrach čipov.</w:t>
       </w:r>
       <w:sdt>
         <w:sdtPr>
@@ -1757,7 +2360,11 @@
         <w:ind w:firstLine="578"/>
       </w:pPr>
       <w:r>
-        <w:t>Používa vlastný rendering engine na vykresľovanie UI ovládacích prvkov, čím zabezpečuje konzistentný vzhľad a správanie naprieč všetkými podporovanými platformami. To znamená, že vývojári môžu zdieľať svoj UI kód a zachovať jednotný vzhľad a pocit bez ohľadu na cieľovú platformu.</w:t>
+        <w:t xml:space="preserve">Používa vlastný rendering engine na vykresľovanie UI ovládacích prvkov, čím zabezpečuje konzistentný vzhľad a správanie naprieč všetkými podporovanými </w:t>
+      </w:r>
+      <w:r>
+        <w:lastRenderedPageBreak/>
+        <w:t>platformami. To znamená, že vývojári môžu zdieľať svoj UI kód a zachovať jednotný vzhľad a pocit bez ohľadu na cieľovú platformu.</w:t>
       </w:r>
       <w:sdt>
         <w:sdtPr>
@@ -1789,10 +2396,14 @@
     </w:p>
     <w:p>
       <w:pPr>
+        <w:ind w:firstLine="578"/>
+      </w:pPr>
+    </w:p>
+    <w:p>
+      <w:pPr>
         <w:pStyle w:val="Heading2"/>
       </w:pPr>
       <w:r>
-        <w:lastRenderedPageBreak/>
         <w:t>MySQL</w:t>
       </w:r>
     </w:p>
@@ -1801,7 +2412,7 @@
         <w:ind w:firstLine="578"/>
       </w:pPr>
       <w:r>
-        <w:t>MySQL je slobodný a otvorený viacvláknový, viacpoužívateľský SQL relačný databázový server. MySQL je podporovaný na viacerých platformách (ako Linux, Windows či Solaris) a je implementovaný vo viacerých programovacích jazykoch ako PHP, C++ či Perl. Databázový systém je relačný, typu DBMS (database management system).</w:t>
+        <w:t>MySQL, najpopulárnejší open source SQL systém na správu databáz, je vyvíjaný, distribuovaný a podporovaný spoločnosťou Oracle Corporation. Databáza je štruktúrovaná kolekcia údajov. Môže ísť o čokoľvek, od jednoduchého nákupného zoznamu až po galériu obrázkov alebo obrovské množstvo informácií v podnikovej sieti. Na pridávanie, prístup a spracovanie údajov uložených v počítačovej databáze potrebujete systém na správu databáz, ako je MySQL Server.</w:t>
       </w:r>
     </w:p>
     <w:p>
@@ -1809,11 +2420,11 @@
         <w:ind w:firstLine="578"/>
       </w:pPr>
       <w:r>
-        <w:t>Každá databáza je v MySQL tvorená z jednej alebo viacerých tabuliek, ktoré majú riadky a stĺpce. V riadkoch sa rozoznávajú jednotlivé záznamy, stĺpce udávajú dátový typ jednotlivých záznamov, pracuje sa s nimi ako s poľami. Práca s MySQL databázou je vykonávaná pomocou dopytov (anglicky queries), ktoré sú tvorené programovacím jazykom SQL (Structured Query Language).</w:t>
+        <w:t>MySQL databázy sú relačné. Relačná databáza ukladá údaje do samostatných tabuliek, namiesto toho, aby všetky údaje boli uložené v jednom veľkom úložisku. Štruktúry databáz sú organizované do fyzických súborov optimalizovaných pre rýchlosť. Logický model, s objektmi ako databázy, tabuľky, pohľady, riadky a stĺpce, poskytuje flexibilné programovacie prostredie.</w:t>
       </w:r>
       <w:sdt>
         <w:sdtPr>
-          <w:id w:val="667224303"/>
+          <w:id w:val="1773203660"/>
           <w:citation/>
         </w:sdtPr>
         <w:sdtEndPr/>
@@ -1822,7 +2433,10 @@
             <w:fldChar w:fldCharType="begin"/>
           </w:r>
           <w:r>
-            <w:instrText xml:space="preserve"> CITATION wiki_mysql \l 1051 </w:instrText>
+            <w:rPr>
+              <w:lang w:val="en-US"/>
+            </w:rPr>
+            <w:instrText xml:space="preserve"> CITATION oracle_mysql \l 1033 </w:instrText>
           </w:r>
           <w:r>
             <w:fldChar w:fldCharType="separate"/>
@@ -1830,8 +2444,16 @@
           <w:r>
             <w:rPr>
               <w:noProof/>
+              <w:lang w:val="en-US"/>
             </w:rPr>
-            <w:t xml:space="preserve"> (4)</w:t>
+            <w:t xml:space="preserve"> </w:t>
+          </w:r>
+          <w:r>
+            <w:rPr>
+              <w:noProof/>
+              <w:lang w:val="en-US"/>
+            </w:rPr>
+            <w:t>(4)</w:t>
           </w:r>
           <w:r>
             <w:fldChar w:fldCharType="end"/>
@@ -1905,11 +2527,11 @@
         <w:ind w:firstLine="578"/>
       </w:pPr>
       <w:r>
-        <w:t>OAuth (skratka pre open authorization) je otvorený štandard pre delegovanie prístupu, bežne používaný ako spôsob, ako používatelia internetu môžu udeliť webovým stránkam alebo aplikáciám prístup k svojim informáciám na iných webových stránkach, ale bez toho, aby im poskytli heslá. Tento mechanizmus používajú spoločnosti ako Amazon, Google, Meta Platforms, Microsoft a Twitter, aby umožnili používateľom zdieľať informácie o svojich účtoch s aplikáciami alebo webovými stránkami tretích strán.</w:t>
+        <w:t>OAuth 2.0 je priemyselný štandardný protokol pre autorizáciu. OAuth 2.0 sa zameriava na jednoduchosť pre vývojárov klientskych aplikácií, pričom poskytuje špecifické autorizačné toky pre webové aplikácie, desktopové aplikácie, mobilné telefóny a zariadenia do obývačky. Táto špecifikácia a jej rozšírenia sú vyvíjané v rámci pracovnej skupiny IETF OAuth.</w:t>
       </w:r>
       <w:sdt>
         <w:sdtPr>
-          <w:id w:val="1364783891"/>
+          <w:id w:val="1527905518"/>
           <w:citation/>
         </w:sdtPr>
         <w:sdtEndPr/>
@@ -1918,7 +2540,10 @@
             <w:fldChar w:fldCharType="begin"/>
           </w:r>
           <w:r>
-            <w:instrText xml:space="preserve"> CITATION wiki_oauth \l 1051 </w:instrText>
+            <w:rPr>
+              <w:lang w:val="en-US"/>
+            </w:rPr>
+            <w:instrText xml:space="preserve">CITATION oauth_2 \l 1033 </w:instrText>
           </w:r>
           <w:r>
             <w:fldChar w:fldCharType="separate"/>
@@ -1926,8 +2551,16 @@
           <w:r>
             <w:rPr>
               <w:noProof/>
+              <w:lang w:val="en-US"/>
             </w:rPr>
-            <w:t xml:space="preserve"> (6)</w:t>
+            <w:t xml:space="preserve"> </w:t>
+          </w:r>
+          <w:r>
+            <w:rPr>
+              <w:noProof/>
+              <w:lang w:val="en-US"/>
+            </w:rPr>
+            <w:t>(6)</w:t>
           </w:r>
           <w:r>
             <w:fldChar w:fldCharType="end"/>
@@ -2011,11 +2644,11 @@
         <w:ind w:firstLine="578"/>
       </w:pPr>
       <w:r>
-        <w:t>Bouncy Castle je zbierka API používaných na implementáciu kryptografie v počítačových programoch. Zahŕňa API pre programovacie jazyky Java aj C#. API sú podporované registrovanou austrálskou charitatívnou organizáciou: Legion of the Bouncy Castle Inc.</w:t>
+        <w:t>Projekt Bouncy Castle ponúka open‑source API pre Java, C# a Kotlin, ktoré podporujú kryptografiu a kryptografické protokoly. Pokrývajú mnoho oblastí bezpečnosti, ako sú infraštruktúra verejných kľúčov, digitálne podpisy, autentifikácia a bezpečná komunikácia. Okrem toho sú k dispozícii aj FIPS certifikované verzie pre Java aj C#.</w:t>
       </w:r>
       <w:sdt>
         <w:sdtPr>
-          <w:id w:val="1667203991"/>
+          <w:id w:val="-477532242"/>
           <w:citation/>
         </w:sdtPr>
         <w:sdtEndPr/>
@@ -2024,7 +2657,10 @@
             <w:fldChar w:fldCharType="begin"/>
           </w:r>
           <w:r>
-            <w:instrText xml:space="preserve"> CITATION wiki_bouncycastle \l 1051 </w:instrText>
+            <w:rPr>
+              <w:lang w:val="en-US"/>
+            </w:rPr>
+            <w:instrText xml:space="preserve"> CITATION bouncycastle_about \l 1033 </w:instrText>
           </w:r>
           <w:r>
             <w:fldChar w:fldCharType="separate"/>
@@ -2032,8 +2668,16 @@
           <w:r>
             <w:rPr>
               <w:noProof/>
+              <w:lang w:val="en-US"/>
             </w:rPr>
-            <w:t xml:space="preserve"> (8)</w:t>
+            <w:t xml:space="preserve"> </w:t>
+          </w:r>
+          <w:r>
+            <w:rPr>
+              <w:noProof/>
+              <w:lang w:val="en-US"/>
+            </w:rPr>
+            <w:t>(8)</w:t>
           </w:r>
           <w:r>
             <w:fldChar w:fldCharType="end"/>
@@ -2056,25 +2700,14 @@
     </w:p>
     <w:p>
       <w:pPr>
-        <w:ind w:firstLine="578"/>
-      </w:pPr>
-      <w:r>
-        <w:t>Blockchain je v informatike špeciálny druh distribuovanej decentralizovanej databázy uchovávajúcej neustále sa rozširujúci počet záznamov, ktoré sú chránené proti neoprávnenému zásahu tak z vonkajšej strany, ako aj zo strany samotných uzlov peer-to-peer siete. Najčastejšou aplikáciou technológie blockchainu je použitie ako účtovná kniha kryptomien (napr. bitcoinu), ktorá uchováva transakcie vykonané užívateľmi. Kombinácia s kryptografiou umožňuje zaistiť atomicitu operácií a zabrániť neoprávneným transakciám.</w:t>
-      </w:r>
-    </w:p>
-    <w:p>
-      <w:pPr>
-        <w:ind w:firstLine="0"/>
-      </w:pPr>
-      <w:r>
-        <w:tab/>
-      </w:r>
-      <w:r>
-        <w:t>Implementácia blockchainu pozostáva z dvoch druhov záznamov: transakcií a blokov. Transakcie predstavujú dáta vložené do databázy užívateľovi, bloky potom záznamy potvrdzujúce, kedy a ako bola konkrétna transakcia pridaná do databázy blockchainu.</w:t>
+        <w:ind w:firstLine="708"/>
+      </w:pPr>
+      <w:r>
+        <w:t>Blockchain je zdieľaná, nemenná digitálna účtovná kniha, ktorá umožňuje zaznamenávanie transakcií a sledovanie aktív v sieti. Funguje ako decentralizovaná distribuovaná databáza, kde sú dáta uložené na viacerých počítačoch, čo ho robí odolným proti manipulácii. Transakcie sú zoskupené do blokov, ktoré sú prepojené do bezpečného a transparentného reťazca, čo zaručuje integritu údajov. Blockchain poskytuje bezpečnosť, transparentnosť a dôveru bez spoliehania sa na tradičných sprostredkovateľov a pomáha firmám zlepšiť efektivitu a znížiť náklady. Táto technológia nachádza uplatnenie nielen v kryptomenách, ale aj v správe dodávateľských reťazcov, zdravotníctve a finančných službách. Okrem toho umožňuje sledovanie a auditovanie transakcií v reálnom čase, čo zvyšuje zodpovednosť a dôveru v systéme.</w:t>
       </w:r>
       <w:sdt>
         <w:sdtPr>
-          <w:id w:val="1509013995"/>
+          <w:id w:val="-567883668"/>
           <w:citation/>
         </w:sdtPr>
         <w:sdtEndPr/>
@@ -2083,7 +2716,10 @@
             <w:fldChar w:fldCharType="begin"/>
           </w:r>
           <w:r>
-            <w:instrText xml:space="preserve"> CITATION wiki_blockchain \l 1051 </w:instrText>
+            <w:rPr>
+              <w:lang w:val="en-US"/>
+            </w:rPr>
+            <w:instrText xml:space="preserve"> CITATION ibm_blockchain \l 1033 </w:instrText>
           </w:r>
           <w:r>
             <w:fldChar w:fldCharType="separate"/>
@@ -2091,8 +2727,16 @@
           <w:r>
             <w:rPr>
               <w:noProof/>
+              <w:lang w:val="en-US"/>
             </w:rPr>
-            <w:t xml:space="preserve"> (9)</w:t>
+            <w:t xml:space="preserve"> </w:t>
+          </w:r>
+          <w:r>
+            <w:rPr>
+              <w:noProof/>
+              <w:lang w:val="en-US"/>
+            </w:rPr>
+            <w:t>(9)</w:t>
           </w:r>
           <w:r>
             <w:fldChar w:fldCharType="end"/>
@@ -2117,7 +2761,7 @@
         <w:ind w:firstLine="432"/>
       </w:pPr>
       <w:r>
-        <w:t>Hlavným cieľom tejto práce bolo navrhnúť a implementovať digitálnu peňaženku vo forme desktopovej aplikácie, určenú najmä na správu kryptomien. Aplikácia bola vyvinutá s využitím technológií .NET (C#), ASP.NET Core Web API a MySQL, pričom používateľské rozhranie bolo realizované prostredníctvom Avalonia UI Frameworku. Výstupom práce je ucelený a plne funkčný návrh desktopovej aplikácie, ktorá umožňuje používateľovi bezpečne spravovať vlastné prostriedky a interagovať s blockchain sieťami.</w:t>
+        <w:t>Hlavný cieľ:</w:t>
       </w:r>
     </w:p>
     <w:p>
@@ -2125,31 +2769,7 @@
         <w:ind w:firstLine="432"/>
       </w:pPr>
       <w:r>
-        <w:t>Medzi</w:t>
-      </w:r>
-      <w:r>
-        <w:t xml:space="preserve"> </w:t>
-      </w:r>
-      <w:r>
-        <w:t>ciele z pohľadu funkčnosti patrí zabezpečenie možnosti registrácie a</w:t>
-      </w:r>
-      <w:r>
-        <w:t> </w:t>
-      </w:r>
-      <w:r>
-        <w:t>prihlasovania</w:t>
-      </w:r>
-      <w:r>
-        <w:t xml:space="preserve"> </w:t>
-      </w:r>
-      <w:r>
-        <w:t>používateľov s overením oprávnenia na prístup do systému,</w:t>
-      </w:r>
-      <w:r>
-        <w:t xml:space="preserve"> teda </w:t>
-      </w:r>
-      <w:r>
-        <w:t>vytvorenie bezpečného systému autentifikácie a autorizácie používateľov s podporou viacúrovňovej ochrany účtu. Ďalej bolo cieľom navrhnúť a implementovať správu používateľov v systéme a umožniť používateľom vytvárať a spravovať vlastné kryptomenové peňaženky v rámci aplikácie.</w:t>
+        <w:t>Hlavným cieľom projektu bolo navrhnúť a implementovať digitálnu peňaženku vo forme desktopovej aplikácie, určenej najmä na správu kryptomien. Aplikácia bola vyvinutá pomocou technológií .NET (C#), ASP.NET Core Web API a MySQL, pričom používateľské rozhranie bolo realizované prostredníctvom Avalonia UI Frameworku. Výstupom práce bol ucelený a plne funkčný návrh desktopovej aplikácie, ktorá umožnila používateľovi bezpečne spravovať vlastné prostriedky a interagovať s blockchain sieťami.</w:t>
       </w:r>
     </w:p>
     <w:p>
@@ -2157,13 +2777,7 @@
         <w:ind w:firstLine="432"/>
       </w:pPr>
       <w:r>
-        <w:t xml:space="preserve">Dôležitou súčasťou bolo </w:t>
-      </w:r>
-      <w:r>
-        <w:t>zaistenie</w:t>
-      </w:r>
-      <w:r>
-        <w:t xml:space="preserve"> bezpečného ukladania a ochrany citlivých údajov, vrátane privátnych kľúčov a seed fráz, a implementácia funkcionalít umožňujúcich realizáciu kryptomenových transakcií s prehľadným zobrazením ich histórie. Rovnako bol kladený dôraz na vytvorenie prehľadného a intuitívneho používateľského rozhrania, ktoré uľahčuje správu účtu, transakcií a bezpečnostných nastavení.</w:t>
+        <w:t>Čiastkové ciele z pohľadu funkčnosti:</w:t>
       </w:r>
     </w:p>
     <w:p>
@@ -2171,7 +2785,119 @@
         <w:ind w:firstLine="432"/>
       </w:pPr>
       <w:r>
-        <w:t>V rámci projektu bolo tiež potrebné naštudovať princípy blockchain technológií, bezpečnostných mechanizmov a možnosti ich implementácie v prostredí .NET, ako aj vypracovať dokumentáciu popisujúcu architektúru riešenia, použité technológie a bezpečnostné postupy. Súčasťou práce bola aj priebežná vizualizácia riešenia, vrátane návrhov používateľského rozhrania a ukážok implementovaných funkcionalít.</w:t>
+        <w:t>•</w:t>
+      </w:r>
+      <w:r>
+        <w:tab/>
+        <w:t>Zabezpečiť možnosť registrácie a prihlasovania používateľov s overením oprávnenia na prístup do systému.</w:t>
+      </w:r>
+    </w:p>
+    <w:p>
+      <w:pPr>
+        <w:ind w:firstLine="432"/>
+      </w:pPr>
+      <w:r>
+        <w:t>•</w:t>
+      </w:r>
+      <w:r>
+        <w:tab/>
+        <w:t>Vytvoriť bezpečný systém autentifikácie a autorizácie používateľov s podporou viacúrovňovej ochrany účtu.</w:t>
+      </w:r>
+    </w:p>
+    <w:p>
+      <w:pPr>
+        <w:ind w:firstLine="432"/>
+      </w:pPr>
+      <w:r>
+        <w:t>•</w:t>
+      </w:r>
+      <w:r>
+        <w:tab/>
+        <w:t>Navrhnúť a implementovať správu používateľov a prístupových práv podľa ich rolí v systéme.</w:t>
+      </w:r>
+    </w:p>
+    <w:p>
+      <w:pPr>
+        <w:ind w:firstLine="432"/>
+      </w:pPr>
+      <w:r>
+        <w:t>•</w:t>
+      </w:r>
+      <w:r>
+        <w:tab/>
+        <w:t>Umožniť používateľom vytvárať a spravovať vlastné kryptomenové peňaženky v rámci aplikácie.</w:t>
+      </w:r>
+    </w:p>
+    <w:p>
+      <w:pPr>
+        <w:ind w:firstLine="432"/>
+      </w:pPr>
+      <w:r>
+        <w:t>•</w:t>
+      </w:r>
+      <w:r>
+        <w:tab/>
+        <w:t>Zabezpečiť bezpečné ukladanie a ochranu citlivých údajov, vrátane privátnych kľúčov a seed fráz.</w:t>
+      </w:r>
+    </w:p>
+    <w:p>
+      <w:pPr>
+        <w:ind w:firstLine="432"/>
+      </w:pPr>
+      <w:r>
+        <w:t>•</w:t>
+      </w:r>
+      <w:r>
+        <w:tab/>
+        <w:t>Implementovať funkcionality pre realizáciu kryptomenových transakcií a ich prehľadné zobrazenie v histórii.</w:t>
+      </w:r>
+    </w:p>
+    <w:p>
+      <w:pPr>
+        <w:ind w:firstLine="432"/>
+      </w:pPr>
+      <w:r>
+        <w:t>•</w:t>
+      </w:r>
+      <w:r>
+        <w:tab/>
+        <w:t>Vytvoriť prehľadné a intuitívne používateľské rozhranie, ktoré umožní jednoduchú správu účtu, transakcií a bezpečnostných nastavení.</w:t>
+      </w:r>
+    </w:p>
+    <w:p>
+      <w:pPr>
+        <w:ind w:firstLine="432"/>
+      </w:pPr>
+      <w:r>
+        <w:t>•</w:t>
+      </w:r>
+      <w:r>
+        <w:tab/>
+        <w:t>Naštudovať princípy blockchain technológií, bezpečnostných mechanizmov a možnosti ich implementácie v prostredí .NET.</w:t>
+      </w:r>
+    </w:p>
+    <w:p>
+      <w:pPr>
+        <w:ind w:firstLine="432"/>
+      </w:pPr>
+      <w:r>
+        <w:t>•</w:t>
+      </w:r>
+      <w:r>
+        <w:tab/>
+        <w:t>Vypracovať sprievodnú dokumentáciu, ktorá popisuje architektúru riešenia, použité technológie a bezpečnostné postupy.</w:t>
+      </w:r>
+    </w:p>
+    <w:p>
+      <w:pPr>
+        <w:ind w:firstLine="432"/>
+      </w:pPr>
+      <w:r>
+        <w:t>•</w:t>
+      </w:r>
+      <w:r>
+        <w:tab/>
+        <w:t>Doložiť priebežnú vizualizáciu riešenia vrátane návrhov používateľského rozhrania a ukážok implementovaných funkcionalít.</w:t>
       </w:r>
     </w:p>
     <w:p>
@@ -2202,7 +2928,10 @@
         <w:fldChar w:fldCharType="begin"/>
       </w:r>
       <w:r>
-        <w:instrText xml:space="preserve"> BIBLIOGRAPHY  \l 1051 </w:instrText>
+        <w:rPr>
+          <w:lang w:val="en-US"/>
+        </w:rPr>
+        <w:instrText xml:space="preserve"> BIBLIOGRAPHY  \l 1033 </w:instrText>
       </w:r>
       <w:r>
         <w:fldChar w:fldCharType="separate"/>
@@ -2239,7 +2968,7 @@
         <w:rPr>
           <w:noProof/>
         </w:rPr>
-        <w:t>[Online] [Dátum: 02. 02 2026.] https://learn.microsoft.com/en-us/dotnet/core/introduction.</w:t>
+        <w:t>[Online] [Cited: 02 02, 2026.] https://learn.microsoft.com/en-us/dotnet/core/introduction.</w:t>
       </w:r>
     </w:p>
     <w:p>
@@ -2281,7 +3010,7 @@
         <w:rPr>
           <w:noProof/>
         </w:rPr>
-        <w:t>[Online] [Dátum: 02. 02 2026.] https://en.wikipedia.org/wiki/ASP.NET_Core.</w:t>
+        <w:t>[Online] [Cited: 02 02, 2026.] https://en.wikipedia.org/wiki/ASP.NET_Core.</w:t>
       </w:r>
     </w:p>
     <w:p>
@@ -2323,7 +3052,7 @@
         <w:rPr>
           <w:noProof/>
         </w:rPr>
-        <w:t>[Online] [Dátum: 02. 02 2026.] https://docs.avaloniaui.net/docs/overview/what-is-avalonia.</w:t>
+        <w:t>[Online] [Cited: 02 02, 2026.] https://docs.avaloniaui.net/docs/overview/what-is-avalonia.</w:t>
       </w:r>
     </w:p>
     <w:p>
@@ -2345,13 +3074,13 @@
           <w:bCs/>
           <w:noProof/>
         </w:rPr>
-        <w:t>Wikipedia contributors.</w:t>
+        <w:t>Oracle Corporation.</w:t>
       </w:r>
       <w:r>
         <w:rPr>
           <w:noProof/>
         </w:rPr>
-        <w:t xml:space="preserve"> MySQL. </w:t>
+        <w:t xml:space="preserve"> MySQL 8.4 Reference Manual: What is MySQL? </w:t>
       </w:r>
       <w:r>
         <w:rPr>
@@ -2359,13 +3088,13 @@
           <w:iCs/>
           <w:noProof/>
         </w:rPr>
-        <w:t xml:space="preserve">Wikipedia. </w:t>
+        <w:t xml:space="preserve">MySQL Reference Manual. </w:t>
       </w:r>
       <w:r>
         <w:rPr>
           <w:noProof/>
         </w:rPr>
-        <w:t>[Online] [Dátum: 02. 02 2026.] https://sk.wikipedia.org/wiki/MySQL.</w:t>
+        <w:t>[Online] [Cited: 02 02, 2026.] https://dev.mysql.com/doc/refman/8.4/en/what-is-mysql.html.</w:t>
       </w:r>
     </w:p>
     <w:p>
@@ -2379,7 +3108,21 @@
         <w:rPr>
           <w:noProof/>
         </w:rPr>
-        <w:t xml:space="preserve">5. —. Application programming interface. </w:t>
+        <w:t xml:space="preserve">5. </w:t>
+      </w:r>
+      <w:r>
+        <w:rPr>
+          <w:b/>
+          <w:bCs/>
+          <w:noProof/>
+        </w:rPr>
+        <w:t>Wikipedia contributors.</w:t>
+      </w:r>
+      <w:r>
+        <w:rPr>
+          <w:noProof/>
+        </w:rPr>
+        <w:t xml:space="preserve"> Application programming interface. </w:t>
       </w:r>
       <w:r>
         <w:rPr>
@@ -2393,7 +3136,7 @@
         <w:rPr>
           <w:noProof/>
         </w:rPr>
-        <w:t>[Online] [Dátum: 02. 02 2026.] https://sk.wikipedia.org/wiki/Application_programming_interface.</w:t>
+        <w:t>[Online] [Cited: 02 02, 2026.] https://sk.wikipedia.org/wiki/Application_programming_interface.</w:t>
       </w:r>
     </w:p>
     <w:p>
@@ -2407,7 +3150,21 @@
         <w:rPr>
           <w:noProof/>
         </w:rPr>
-        <w:t xml:space="preserve">6. —. OAuth. </w:t>
+        <w:t xml:space="preserve">6. </w:t>
+      </w:r>
+      <w:r>
+        <w:rPr>
+          <w:b/>
+          <w:bCs/>
+          <w:noProof/>
+        </w:rPr>
+        <w:t>OAuth.</w:t>
+      </w:r>
+      <w:r>
+        <w:rPr>
+          <w:noProof/>
+        </w:rPr>
+        <w:t xml:space="preserve"> OAuth 2.0. </w:t>
       </w:r>
       <w:r>
         <w:rPr>
@@ -2415,13 +3172,13 @@
           <w:iCs/>
           <w:noProof/>
         </w:rPr>
-        <w:t xml:space="preserve">Wikipedia. </w:t>
+        <w:t xml:space="preserve">OAuth.net. </w:t>
       </w:r>
       <w:r>
         <w:rPr>
           <w:noProof/>
         </w:rPr>
-        <w:t>[Online] [Dátum: 02. 02 2026.] https://en.wikipedia.org/wiki/OAuth.</w:t>
+        <w:t>[Online] [Cited: 02 02, 2026.] https://oauth.net/2/.</w:t>
       </w:r>
     </w:p>
     <w:p>
@@ -2435,7 +3192,21 @@
         <w:rPr>
           <w:noProof/>
         </w:rPr>
-        <w:t xml:space="preserve">7. —. Git. </w:t>
+        <w:t xml:space="preserve">7. </w:t>
+      </w:r>
+      <w:r>
+        <w:rPr>
+          <w:b/>
+          <w:bCs/>
+          <w:noProof/>
+        </w:rPr>
+        <w:t>Wikipedia contributors.</w:t>
+      </w:r>
+      <w:r>
+        <w:rPr>
+          <w:noProof/>
+        </w:rPr>
+        <w:t xml:space="preserve"> Git. </w:t>
       </w:r>
       <w:r>
         <w:rPr>
@@ -2449,7 +3220,7 @@
         <w:rPr>
           <w:noProof/>
         </w:rPr>
-        <w:t>[Online] [Dátum: 02. 02 2026.] https://en.wikipedia.org/wiki/Git.</w:t>
+        <w:t>[Online] [Cited: 02 02, 2026.] https://en.wikipedia.org/wiki/Git.</w:t>
       </w:r>
     </w:p>
     <w:p>
@@ -2463,7 +3234,21 @@
         <w:rPr>
           <w:noProof/>
         </w:rPr>
-        <w:t xml:space="preserve">8. —. Bouncy Castle (cryptography). </w:t>
+        <w:t xml:space="preserve">8. </w:t>
+      </w:r>
+      <w:r>
+        <w:rPr>
+          <w:b/>
+          <w:bCs/>
+          <w:noProof/>
+        </w:rPr>
+        <w:t>Bouncy Castle Inc.</w:t>
+      </w:r>
+      <w:r>
+        <w:rPr>
+          <w:noProof/>
+        </w:rPr>
+        <w:t xml:space="preserve"> About Bouncy Castle. </w:t>
       </w:r>
       <w:r>
         <w:rPr>
@@ -2471,13 +3256,13 @@
           <w:iCs/>
           <w:noProof/>
         </w:rPr>
-        <w:t xml:space="preserve">Wikipedia. </w:t>
+        <w:t xml:space="preserve">Bouncy Castle. </w:t>
       </w:r>
       <w:r>
         <w:rPr>
           <w:noProof/>
         </w:rPr>
-        <w:t>[Online] [Dátum: 02. 02 2026.] https://en.wikipedia.org/wiki/Bouncy_Castle_(cryptography).</w:t>
+        <w:t>[Online] [Cited: 02 02, 2026.] https://www.bouncycastle.org/about/.</w:t>
       </w:r>
     </w:p>
     <w:p>
@@ -2491,7 +3276,21 @@
         <w:rPr>
           <w:noProof/>
         </w:rPr>
-        <w:t xml:space="preserve">9. —. Blockchain. </w:t>
+        <w:t xml:space="preserve">9. </w:t>
+      </w:r>
+      <w:r>
+        <w:rPr>
+          <w:b/>
+          <w:bCs/>
+          <w:noProof/>
+        </w:rPr>
+        <w:t>IBM Corporation.</w:t>
+      </w:r>
+      <w:r>
+        <w:rPr>
+          <w:noProof/>
+        </w:rPr>
+        <w:t xml:space="preserve"> What is blockchain? </w:t>
       </w:r>
       <w:r>
         <w:rPr>
@@ -2499,13 +3298,13 @@
           <w:iCs/>
           <w:noProof/>
         </w:rPr>
-        <w:t xml:space="preserve">Wikipedia. </w:t>
+        <w:t xml:space="preserve">IBM Think. </w:t>
       </w:r>
       <w:r>
         <w:rPr>
           <w:noProof/>
         </w:rPr>
-        <w:t>[Online] [Dátum: 02. 02 2026.] https://sk.wikipedia.org/wiki/Blockchain.</w:t>
+        <w:t>[Online] [Cited: 02 02, 2026.] https://www.ibm.com/think/topics/blockchain.</w:t>
       </w:r>
     </w:p>
     <w:p>
@@ -2516,7 +3315,1446 @@
         <w:fldChar w:fldCharType="end"/>
       </w:r>
     </w:p>
+    <w:p>
+      <w:r>
+        <w:br w:type="page"/>
+      </w:r>
+    </w:p>
+    <w:p>
+      <w:pPr>
+        <w:pStyle w:val="Heading1"/>
+      </w:pPr>
+      <w:r>
+        <w:lastRenderedPageBreak/>
+        <w:t>Materiál a metodika práce</w:t>
+      </w:r>
+    </w:p>
+    <w:p>
+      <w:pPr>
+        <w:pStyle w:val="Heading2"/>
+      </w:pPr>
+      <w:r>
+        <w:t>Výber technológií a nástrojov</w:t>
+      </w:r>
+    </w:p>
+    <w:p>
+      <w:pPr>
+        <w:ind w:firstLine="708"/>
+      </w:pPr>
+      <w:r>
+        <w:t>Pri realizácii projektu BlockSense sme sa rozhodli používať moderné, overené a dobre podporované technológie, ktoré nám zaručovali bezpečnosť, výkon a stabilitu. Naším cieľom bolo vytvoriť robustný systém, ktorý je schopný bezpečne manipulovať s citlivými údajmi používateľov, poskytovať rýchlu odozvu a byť rozšíriteľný do budúcnosti.</w:t>
+      </w:r>
+    </w:p>
+    <w:p>
+      <w:pPr>
+        <w:pStyle w:val="Heading3"/>
+      </w:pPr>
+      <w:r>
+        <w:t>Desktopový klient – Avalonia UI Framework</w:t>
+      </w:r>
+    </w:p>
+    <w:p>
+      <w:pPr>
+        <w:ind w:firstLine="708"/>
+      </w:pPr>
+      <w:r>
+        <w:t>Pre vývoj desktopového klienta sme zvolili Avalonia UI Framework, ktorý umožňuje vytvárať responzívne a prehľadné používateľské rozhranie v prostredí .NET. Avalonia poskytuje cross-platformové možnosti, čo znamená, že aplikáciu je možné spustiť na Windows, macOS a Linux, pričom my sme sa primárne zamerali na Windows ako hlavný cieľový operačný systém.</w:t>
+      </w:r>
+    </w:p>
+    <w:p>
+      <w:pPr>
+        <w:ind w:firstLine="708"/>
+      </w:pPr>
+      <w:r>
+        <w:t>Pri návrhu UI sme kládli dôraz na prehľadnosť a intuitívnosť, pričom sme implementovali modulárne komponenty, ktoré sa dajú jednoducho rozšíriť o nové funkcionality.</w:t>
+      </w:r>
+    </w:p>
+    <w:p>
+      <w:pPr>
+        <w:pStyle w:val="Heading3"/>
+      </w:pPr>
+      <w:r>
+        <w:t>Backend – ASP.NET Core Web API</w:t>
+      </w:r>
+    </w:p>
+    <w:p>
+      <w:pPr>
+        <w:ind w:firstLine="708"/>
+      </w:pPr>
+      <w:r>
+        <w:t>Backend aplikácie sme implementovali pomocou ASP.NET Core Web API, čo nám umožnilo efektívne spracovávať požiadavky klienta, bezpečne manipulovať s citlivými dátami a poskytovať RESTful API rozhranie.</w:t>
+      </w:r>
+    </w:p>
+    <w:p>
+      <w:pPr>
+        <w:ind w:firstLine="708"/>
+      </w:pPr>
+      <w:r>
+        <w:t>Pre správu relácií a autentifikáciu sme využili OAuth 2.0 protokol, čo zabezpečilo flexibilné a bezpečné riešenie správy tokenov pre klientov. Architektúra servera bola navrhnutá s dôrazom na škálovateľnosť, aby bolo možné pridávať nové moduly bez ovplyvnenia existujúcej logiky.</w:t>
+      </w:r>
+    </w:p>
+    <w:p>
+      <w:pPr>
+        <w:pStyle w:val="Heading3"/>
+      </w:pPr>
+      <w:r>
+        <w:t>Databázové riešenie</w:t>
+      </w:r>
+    </w:p>
+    <w:p>
+      <w:pPr>
+        <w:ind w:firstLine="708"/>
+      </w:pPr>
+      <w:r>
+        <w:t>Databázová časť projektu bola realizovaná pomocou MySQL, čím sme dosiahli b</w:t>
+      </w:r>
+      <w:r>
+        <w:t>ezpečné ukladanie používateľských a systémových dát.</w:t>
+      </w:r>
+      <w:r>
+        <w:t xml:space="preserve"> Pre lokálne ukladanie dát sme využili LevelDB, čo zabezpečilo rýchly prístup k citlivým dátam bez ich odosielania na server. Táto kombinácia serverovej a lokálnej databázy nám umožnila zachovať princíp </w:t>
+      </w:r>
+      <w:r>
+        <w:lastRenderedPageBreak/>
+        <w:t>zero-knowledge, t. j. server nikdy neukladá ani nepozná privátne kľúče a seed frázy používateľov.</w:t>
+      </w:r>
+    </w:p>
+    <w:p>
+      <w:pPr>
+        <w:ind w:firstLine="708"/>
+      </w:pPr>
+      <w:r>
+        <w:t>Pri práci s MySQL sme dôsledne využívali databázové transakcie. Všetky operácie, ktoré zahrňovali viacero krokov, ako napríklad registrácia používateľa alebo aktualizácia pozývacieho kódu, sme vykonávali v rámci transakcií. Tento prístup nám umožnil zabezpečiť atomickosť, konzistenciu a integritu dát, a v prípade chyby automaticky rollbacknúť (návrat do pôvodného stavu) všetky zmeny, čím sme zabránili nekonzistentnému stavu databázy.</w:t>
+      </w:r>
+    </w:p>
+    <w:p>
+      <w:pPr>
+        <w:pStyle w:val="Heading3"/>
+      </w:pPr>
+      <w:r>
+        <w:t>Bezpečnostné mechanizmy a zoznam použitých balíčkov</w:t>
+      </w:r>
+    </w:p>
+    <w:p>
+      <w:pPr>
+        <w:ind w:firstLine="708"/>
+      </w:pPr>
+      <w:r>
+        <w:t xml:space="preserve">Na ochranu citlivých údajov sme implementovali AES-256 šifrovanie pre ukladanie seed fráz </w:t>
+      </w:r>
+      <w:r>
+        <w:t xml:space="preserve">a </w:t>
+      </w:r>
+      <w:r>
+        <w:t>privátnych kľúčov a Argon2Id hashovanie pre bezpečné ukladanie hesiel. Na implementáciu týchto mechanizmov sme využili nasledujúce NuGet balíčky:</w:t>
+      </w:r>
+    </w:p>
+    <w:p>
+      <w:pPr>
+        <w:pStyle w:val="ListParagraph"/>
+        <w:numPr>
+          <w:ilvl w:val="0"/>
+          <w:numId w:val="3"/>
+        </w:numPr>
+      </w:pPr>
+      <w:r>
+        <w:t>BouncyCastle (1.9.0) – poskytuje kryptografické algoritmy, vrátane AES, RSA, HMAC a generovania kľúčov. Použili sme ho na lokálne šifrovanie seed fráz a privátnych kľúčov.</w:t>
+      </w:r>
+    </w:p>
+    <w:p>
+      <w:pPr>
+        <w:pStyle w:val="ListParagraph"/>
+        <w:numPr>
+          <w:ilvl w:val="0"/>
+          <w:numId w:val="3"/>
+        </w:numPr>
+      </w:pPr>
+      <w:r>
+        <w:t>Microsoft.AspNetCore.Authentication.JwtBearer (8.0.0) – implementácia JWT autentifikácie na serveri.</w:t>
+      </w:r>
+    </w:p>
+    <w:p>
+      <w:pPr>
+        <w:pStyle w:val="ListParagraph"/>
+        <w:numPr>
+          <w:ilvl w:val="0"/>
+          <w:numId w:val="3"/>
+        </w:numPr>
+      </w:pPr>
+      <w:r>
+        <w:t>Otp.NET (2.0.0) – generovanie TOTP kódov pre dvojfaktorovú autentifikáciu.</w:t>
+      </w:r>
+    </w:p>
+    <w:p>
+      <w:pPr>
+        <w:pStyle w:val="ListParagraph"/>
+        <w:numPr>
+          <w:ilvl w:val="0"/>
+          <w:numId w:val="3"/>
+        </w:numPr>
+      </w:pPr>
+      <w:r>
+        <w:t>MySql.Data (8.0.35) – klient pre pripojenie ASP.NET Core API k MySQL databáze.</w:t>
+      </w:r>
+    </w:p>
+    <w:p>
+      <w:pPr>
+        <w:pStyle w:val="ListParagraph"/>
+        <w:numPr>
+          <w:ilvl w:val="0"/>
+          <w:numId w:val="3"/>
+        </w:numPr>
+      </w:pPr>
+      <w:r>
+        <w:t>Dapper (2.0.123) – mikro-ORM pre efektívnu prácu s databázou.</w:t>
+      </w:r>
+    </w:p>
+    <w:p>
+      <w:pPr>
+        <w:pStyle w:val="ListParagraph"/>
+        <w:numPr>
+          <w:ilvl w:val="0"/>
+          <w:numId w:val="3"/>
+        </w:numPr>
+      </w:pPr>
+      <w:r>
+        <w:t>LevelDB.NET (1.3.0) – .NET wrapper pre LevelDB na lokálne ukladanie šifrovaných peňaženiek.</w:t>
+      </w:r>
+    </w:p>
+    <w:p>
+      <w:pPr>
+        <w:pStyle w:val="ListParagraph"/>
+        <w:numPr>
+          <w:ilvl w:val="0"/>
+          <w:numId w:val="3"/>
+        </w:numPr>
+      </w:pPr>
+      <w:r>
+        <w:t>Serilog (3.0.1) – logovanie aktivít a chýb.</w:t>
+      </w:r>
+    </w:p>
+    <w:p>
+      <w:pPr>
+        <w:ind w:left="360" w:firstLine="348"/>
+      </w:pPr>
+      <w:r>
+        <w:t xml:space="preserve">Použitie týchto nástrojov a balíčkov nám umožnilo vytvoriť bezpečnú a škálovateľnú architektúru. Kombinácia </w:t>
+      </w:r>
+      <w:r>
+        <w:t>týchto technológií</w:t>
+      </w:r>
+      <w:r>
+        <w:t xml:space="preserve"> zabezpečila, že aplikácia je spoľahlivá, intuitívna a bezpečná, pričom podporuje Windows ako primárny operačný systém.</w:t>
+      </w:r>
+    </w:p>
+    <w:p>
+      <w:pPr>
+        <w:pStyle w:val="Heading3"/>
+      </w:pPr>
+      <w:r>
+        <w:t xml:space="preserve">Verzovanie kódu </w:t>
+      </w:r>
+      <w:r>
+        <w:t>–</w:t>
+      </w:r>
+      <w:r>
+        <w:t xml:space="preserve"> Git</w:t>
+      </w:r>
+    </w:p>
+    <w:p>
+      <w:pPr>
+        <w:ind w:firstLine="708"/>
+      </w:pPr>
+      <w:r>
+        <w:t xml:space="preserve">Dôležitou súčasťou vývoja bolo aj spracovanie kódu prostredníctvom Git-u, čo nám umožnilo sledovanie </w:t>
+      </w:r>
+      <w:r>
+        <w:t xml:space="preserve">histórie </w:t>
+      </w:r>
+      <w:r>
+        <w:t>zmien, bezpečné riadenie</w:t>
+      </w:r>
+      <w:r>
+        <w:t xml:space="preserve"> vývojových</w:t>
+      </w:r>
+      <w:r>
+        <w:t xml:space="preserve"> vetiev a </w:t>
+      </w:r>
+      <w:r>
+        <w:lastRenderedPageBreak/>
+        <w:t>efektívnu implementáciu jednotlivých funkcionalít. Git sme využívali najmä pre prehľadnú správu zdrojového kódu a kontrolu jednotlivých vývojových krokov, kde každá nová funkcia bola implementovaná vo vlastnej vetve a po otestovaní zlúčená do hlavnej vetvy.</w:t>
+      </w:r>
+    </w:p>
+    <w:p>
+      <w:pPr>
+        <w:pStyle w:val="Heading2"/>
+      </w:pPr>
+      <w:r>
+        <w:t>Návrh architektúry systému</w:t>
+      </w:r>
+    </w:p>
+    <w:p>
+      <w:r>
+        <w:t>Pri návrhu systému BlockSense sme sa rozhodli použiť klient-server architektúru, ktorá jasne oddelila používateľské rozhranie od aplikačnej logiky a spracovania citlivých dát. Tento prístup nám umožnil efektívne rozložiť zodpovednosti medzi klienta a server a zároveň zabezpečiť bezpečné uchovávanie a spracovanie údajov používateľov.</w:t>
+      </w:r>
+    </w:p>
+    <w:p>
+      <w:r>
+        <w:t>Citlivé údaje, ako privátne kľúče a seed frázy, sa nikdy neukladali ani neodosielali na server. Namiesto toho sme implementovali lokálne šifrovanie pomocou AES-256 pred uložením do LevelDB, čo zabezpečilo, že citlivé údaje zostali výhradne v prostredí klienta. Pri každej operácii s</w:t>
+      </w:r>
+      <w:r>
+        <w:t> </w:t>
+      </w:r>
+      <w:r>
+        <w:t>peňaženkou</w:t>
+      </w:r>
+      <w:r>
+        <w:t xml:space="preserve">, </w:t>
+      </w:r>
+      <w:r>
+        <w:t>klient pracoval s dešifrovanými dátami iba v pamäti, čím sme eliminovali riziko úniku dát.</w:t>
+      </w:r>
+    </w:p>
+    <w:p>
+      <w:r>
+        <w:t xml:space="preserve">Server uchovával </w:t>
+      </w:r>
+      <w:r>
+        <w:t>hashované</w:t>
+      </w:r>
+      <w:r>
+        <w:t xml:space="preserve"> refresh tokeny, ktoré umožňovali obnovenie JWT tokenov klienta bez potreby opätovného zadávania hesla. Tokeny sme uchovávali v databáze a každému refresh tokenu sme </w:t>
+      </w:r>
+      <w:r>
+        <w:t>definovali</w:t>
+      </w:r>
+      <w:r>
+        <w:t xml:space="preserve"> dátum expirácie, čo zabezpečilo bezpečné a kontrolované obnovenie prístupu.</w:t>
+      </w:r>
+    </w:p>
+    <w:p>
+      <w:pPr>
+        <w:pStyle w:val="Heading3"/>
+      </w:pPr>
+      <w:r>
+        <w:t>Komunikácia medzi klientom a</w:t>
+      </w:r>
+      <w:r>
+        <w:t> </w:t>
+      </w:r>
+      <w:r>
+        <w:t>serverom</w:t>
+      </w:r>
+    </w:p>
+    <w:p>
+      <w:pPr>
+        <w:ind w:firstLine="708"/>
+      </w:pPr>
+      <w:r>
+        <w:t>Všetka komunikácia medzi klientom a serverom prebiehala prostredníctvom HTTPS protokolu, čím sme zabezpečili šifrovanie dát počas prenosu. Každá požiadavka klienta obsahovala JWT token pre autentifikáciu a identifikáciu používateľa. Server overoval platnosť tokenu, kontroloval oprávnenia priradené k role používateľa a až potom spracoval požiadavku.</w:t>
+      </w:r>
+    </w:p>
+    <w:p>
+      <w:pPr>
+        <w:ind w:firstLine="708"/>
+      </w:pPr>
+      <w:r>
+        <w:t>Pri spracovaní transakcií klient podpisoval transakcie lokálne privátnym kľúčom, a server tieto podpísané transakcie iba validoval a zasielal do blockchain siete. Takto sme zabezpečili, že citlivé kľúče nikdy neopustili klienta a server slúžil len ako sprostredkovateľ a kontrolný mechanizmus</w:t>
+      </w:r>
+      <w:r>
+        <w:t>.</w:t>
+      </w:r>
+    </w:p>
+    <w:p>
+      <w:pPr>
+        <w:pStyle w:val="Heading3"/>
+      </w:pPr>
+      <w:r>
+        <w:t>Pozvánkový systém</w:t>
+      </w:r>
+    </w:p>
+    <w:p>
+      <w:pPr>
+        <w:ind w:firstLine="708"/>
+      </w:pPr>
+      <w:r>
+        <w:t xml:space="preserve">Systém obsahoval pozvánkový mechanizmus, ktorý umožňoval vstup do </w:t>
+      </w:r>
+      <w:r>
+        <w:t>systému</w:t>
+      </w:r>
+      <w:r>
+        <w:t xml:space="preserve"> iba oprávneným používateľom. Každý pozývací kód</w:t>
+      </w:r>
+      <w:r>
+        <w:t xml:space="preserve"> (pozvánka)</w:t>
+      </w:r>
+      <w:r>
+        <w:t xml:space="preserve"> bol uložený v databáze </w:t>
+      </w:r>
+      <w:r>
+        <w:lastRenderedPageBreak/>
+        <w:t>a pri úspešnej registrácii označený ako použitý, aby sa zabránilo jeho opakovanému použitiu. Pozvánkový systém sme integrovali priamo do registračného procesu, čím sme zabezpečili kontrolu prístupu ešte pred vytvorením používateľského účtu.</w:t>
+      </w:r>
+    </w:p>
+    <w:p>
+      <w:pPr>
+        <w:pStyle w:val="Heading3"/>
+      </w:pPr>
+      <w:r>
+        <w:t>Spracovanie chýb a výnimiek na serveri</w:t>
+      </w:r>
+    </w:p>
+    <w:p>
+      <w:pPr>
+        <w:ind w:firstLine="708"/>
+      </w:pPr>
+      <w:r>
+        <w:t>Pri návrhu backendu sme kládli dôraz na spoľahlivé spracovanie chýb. Implementovali sme Global Exception Handler, ktorý zachytával všetky výnimky v rámci API. Tento mechanizmus zabezpečil, že klient nikdy nedostal nespracovanú alebo citlivú chybovú správu, ktorá by mohla odhaliť vnútornú štruktúru serveru alebo databázy.</w:t>
+      </w:r>
+    </w:p>
+    <w:p>
+      <w:pPr>
+        <w:ind w:firstLine="708"/>
+      </w:pPr>
+      <w:r>
+        <w:t>Každá výnimka bola logovaná prostredníctvom Serilog a zároveň API vracalo štruktúrovanú odpoveď vo forme JSON, ktorá obsahovala len potrebné informácie pre klienta, napríklad typ</w:t>
+      </w:r>
+      <w:r>
+        <w:t>, názov a popis chyby a identifikátor (Trace ID)</w:t>
+      </w:r>
+      <w:r>
+        <w:t>. Tento prístup umožnil klientovi</w:t>
+      </w:r>
+      <w:r>
+        <w:t xml:space="preserve"> </w:t>
+      </w:r>
+      <w:r>
+        <w:t xml:space="preserve">reagovať na </w:t>
+      </w:r>
+      <w:r>
+        <w:t xml:space="preserve">konkrétne </w:t>
+      </w:r>
+      <w:r>
+        <w:t>chyby a zároveň zachoval bezpečnosť systému.</w:t>
+      </w:r>
+    </w:p>
+    <w:p>
+      <w:pPr>
+        <w:ind w:firstLine="708"/>
+      </w:pPr>
+      <w:r>
+        <w:t>Mechanizmus bol navrhnutý tak, aby sa nové typy chýb mohli centrálne spracovať bez potreby modifikácie jednotlivých endpointov. V kombinácii s kontrolou oprávnení a overovaním JWT tokenov zabezpečil tento systém vysokú odolnosť voči útokom a minimalizoval riziko nepredvídaných stavov pri komunikácii klient-server.</w:t>
+      </w:r>
+    </w:p>
+    <w:p>
+      <w:pPr>
+        <w:pStyle w:val="Heading2"/>
+      </w:pPr>
+      <w:r>
+        <w:t>Implementácia autentifikácie a</w:t>
+      </w:r>
+      <w:r>
+        <w:t> </w:t>
+      </w:r>
+      <w:r>
+        <w:t>autorizácie</w:t>
+      </w:r>
+    </w:p>
+    <w:p>
+      <w:pPr>
+        <w:ind w:firstLine="708"/>
+      </w:pPr>
+      <w:r>
+        <w:t>Pri implementácii autentifikácie a autorizácie v projekte BlockSense sme sa zamerali na bezpečný a flexibilný systém správy používateľských účtov, tokenov a dvojfaktorovej autentifikácie. Architektúra bola navrhnutá tak, aby citlivé údaje</w:t>
+      </w:r>
+      <w:r>
+        <w:t xml:space="preserve"> </w:t>
+      </w:r>
+      <w:r>
+        <w:t>nikdy neopustili bezpečné prostredie klienta a aby server spravoval iba hashované alebo šifrované dáta.</w:t>
+      </w:r>
+    </w:p>
+    <w:p>
+      <w:pPr>
+        <w:pStyle w:val="Heading3"/>
+      </w:pPr>
+      <w:r>
+        <w:t>Registrácia používateľa</w:t>
+      </w:r>
+    </w:p>
+    <w:p>
+      <w:pPr>
+        <w:ind w:firstLine="708"/>
+      </w:pPr>
+      <w:r>
+        <w:t>Proces registrácie začína overením pozývacieho kódu, ktorý zabezpečuje, že do systému môžu vstupovať iba oprávnení používatelia. Server načíta pozývací kód z databázy a označí ho ako použitý až po úspešnej registrácii, čím sa zabraňuje jeho opakovanému použitiu.</w:t>
+      </w:r>
+    </w:p>
+    <w:p>
+      <w:pPr>
+        <w:ind w:firstLine="708"/>
+      </w:pPr>
+      <w:r>
+        <w:t>Používateľské heslá sú hashované pomocou algoritmu Argon2id, ktorý poskytuje vysokú odolnosť proti brute-force útokom a rainbow table útokom. Pri registrácii sa generuje jedinečný salt, ktorý sa uloží spolu s hashom do databázy.</w:t>
+      </w:r>
+    </w:p>
+    <w:p>
+      <w:pPr>
+        <w:ind w:firstLine="708"/>
+      </w:pPr>
+      <w:r>
+        <w:lastRenderedPageBreak/>
+        <w:t xml:space="preserve">Po úspešnej registrácii systém vracia </w:t>
+      </w:r>
+      <w:r>
+        <w:t xml:space="preserve">jedinečný </w:t>
+      </w:r>
+      <w:r>
+        <w:t>identifikátor používateľa</w:t>
+      </w:r>
+      <w:r>
+        <w:t>.</w:t>
+      </w:r>
+      <w:r>
+        <w:t xml:space="preserve"> Desktopový klient následne zobrazuje potvrdenie registrácie a</w:t>
+      </w:r>
+      <w:r>
+        <w:t> používateľ sa môže následne do systému prihlásiť</w:t>
+      </w:r>
+      <w:r>
+        <w:t>.</w:t>
+      </w:r>
+    </w:p>
+    <w:p>
+      <w:pPr>
+        <w:pStyle w:val="Heading3"/>
+      </w:pPr>
+      <w:r>
+        <w:t>Autentifikácia používateľa</w:t>
+      </w:r>
+    </w:p>
+    <w:p>
+      <w:pPr>
+        <w:ind w:firstLine="708"/>
+      </w:pPr>
+      <w:r>
+        <w:t xml:space="preserve">Pri prihlasovaní používateľa klient odosiela </w:t>
+      </w:r>
+      <w:r>
+        <w:t>používateľské meno alebo email</w:t>
+      </w:r>
+      <w:r>
+        <w:t xml:space="preserve"> </w:t>
+      </w:r>
+      <w:r>
+        <w:t xml:space="preserve">a heslo na server. Server najskôr vyhľadá používateľa a overí, či účet nebol zablokovaný alebo odstránený. Heslo je </w:t>
+      </w:r>
+      <w:r>
+        <w:t xml:space="preserve">následne </w:t>
+      </w:r>
+      <w:r>
+        <w:t>overované pomocou Argon2id hashovania a porovnávania v časovo konštantnom režime (FixedTimeEquals), aby sa zabránilo útokom typu timing attack.</w:t>
+      </w:r>
+    </w:p>
+    <w:p>
+      <w:pPr>
+        <w:ind w:firstLine="708"/>
+      </w:pPr>
+      <w:r>
+        <w:t>V prípade aktivovanej</w:t>
+      </w:r>
+      <w:r>
+        <w:t xml:space="preserve"> dvojfaktorovej autentifikácií</w:t>
+      </w:r>
+      <w:r>
+        <w:t xml:space="preserve"> server vyžaduje dodatočný jednorazový kód generovaný </w:t>
+      </w:r>
+      <w:r>
+        <w:t>klientom</w:t>
+      </w:r>
+      <w:r>
+        <w:t>.</w:t>
+      </w:r>
+      <w:r>
+        <w:t xml:space="preserve"> Ak kód chýba alebo je neplatný, server odmietne prístup a vráti špecifickú chybu</w:t>
+      </w:r>
+      <w:r>
+        <w:t>.</w:t>
+      </w:r>
+    </w:p>
+    <w:p>
+      <w:pPr>
+        <w:ind w:firstLine="708"/>
+      </w:pPr>
+      <w:r>
+        <w:t xml:space="preserve">Po úspešnej autentifikácii server vygeneruje JWT access token s limitovanou platnosťou a refresh token, ktorý je viazaný na konkrétne zariadenie. Tieto tokeny sú následne odoslané klientovi, ktorý ich ukladá lokálne a používa pri ďalších </w:t>
+      </w:r>
+      <w:r>
+        <w:t>požiadavkach</w:t>
+      </w:r>
+      <w:r>
+        <w:t>.</w:t>
+      </w:r>
+    </w:p>
+    <w:p>
+      <w:pPr>
+        <w:pStyle w:val="Heading3"/>
+      </w:pPr>
+      <w:r>
+        <w:rPr>
+          <w:noProof/>
+        </w:rPr>
+        <mc:AlternateContent>
+          <mc:Choice Requires="wps">
+            <w:drawing>
+              <wp:anchor distT="0" distB="0" distL="114300" distR="114300" simplePos="0" relativeHeight="251670528" behindDoc="0" locked="0" layoutInCell="1" allowOverlap="1" wp14:anchorId="6996F207" wp14:editId="7215557A">
+                <wp:simplePos x="0" y="0"/>
+                <wp:positionH relativeFrom="column">
+                  <wp:posOffset>603885</wp:posOffset>
+                </wp:positionH>
+                <wp:positionV relativeFrom="paragraph">
+                  <wp:posOffset>2919730</wp:posOffset>
+                </wp:positionV>
+                <wp:extent cx="4185285" cy="635"/>
+                <wp:effectExtent l="0" t="0" r="0" b="0"/>
+                <wp:wrapSquare wrapText="bothSides"/>
+                <wp:docPr id="20" name="Text Box 20"/>
+                <wp:cNvGraphicFramePr/>
+                <a:graphic xmlns:a="http://schemas.openxmlformats.org/drawingml/2006/main">
+                  <a:graphicData uri="http://schemas.microsoft.com/office/word/2010/wordprocessingShape">
+                    <wps:wsp>
+                      <wps:cNvSpPr txBox="1"/>
+                      <wps:spPr>
+                        <a:xfrm>
+                          <a:off x="0" y="0"/>
+                          <a:ext cx="4185285" cy="635"/>
+                        </a:xfrm>
+                        <a:prstGeom prst="rect">
+                          <a:avLst/>
+                        </a:prstGeom>
+                        <a:solidFill>
+                          <a:prstClr val="white"/>
+                        </a:solidFill>
+                        <a:ln>
+                          <a:noFill/>
+                        </a:ln>
+                      </wps:spPr>
+                      <wps:txbx>
+                        <w:txbxContent>
+                          <w:p>
+                            <w:pPr>
+                              <w:pStyle w:val="Caption"/>
+                              <w:rPr>
+                                <w:b/>
+                                <w:noProof/>
+                                <w:sz w:val="28"/>
+                                <w:szCs w:val="28"/>
+                              </w:rPr>
+                            </w:pPr>
+                            <w:bookmarkStart w:id="4" w:name="_Toc221475776"/>
+                            <w:r>
+                              <w:t xml:space="preserve">Obrázok </w:t>
+                            </w:r>
+                            <w:fldSimple w:instr=" SEQ Obrázok \* ARABIC ">
+                              <w:r>
+                                <w:rPr>
+                                  <w:noProof/>
+                                </w:rPr>
+                                <w:t>1</w:t>
+                              </w:r>
+                            </w:fldSimple>
+                            <w:r>
+                              <w:t xml:space="preserve"> </w:t>
+                            </w:r>
+                            <w:r>
+                              <w:t>Sekvenčný diagram autorizačného toku OAuth 2.0</w:t>
+                            </w:r>
+                            <w:bookmarkEnd w:id="4"/>
+                          </w:p>
+                        </w:txbxContent>
+                      </wps:txbx>
+                      <wps:bodyPr rot="0" spcFirstLastPara="0" vertOverflow="overflow" horzOverflow="overflow" vert="horz" wrap="square" lIns="0" tIns="0" rIns="0" bIns="0" numCol="1" spcCol="0" rtlCol="0" fromWordArt="0" anchor="t" anchorCtr="0" forceAA="0" compatLnSpc="1">
+                        <a:prstTxWarp prst="textNoShape">
+                          <a:avLst/>
+                        </a:prstTxWarp>
+                        <a:spAutoFit/>
+                      </wps:bodyPr>
+                    </wps:wsp>
+                  </a:graphicData>
+                </a:graphic>
+              </wp:anchor>
+            </w:drawing>
+          </mc:Choice>
+          <mc:Fallback>
+            <w:pict>
+              <v:shapetype w14:anchorId="6996F207" id="_x0000_t202" coordsize="21600,21600" o:spt="202" path="m,l,21600r21600,l21600,xe">
+                <v:stroke joinstyle="miter"/>
+                <v:path gradientshapeok="t" o:connecttype="rect"/>
+              </v:shapetype>
+              <v:shape id="Text Box 20" o:spid="_x0000_s1026" type="#_x0000_t202" style="position:absolute;left:0;text-align:left;margin-left:47.55pt;margin-top:229.9pt;width:329.55pt;height:.05pt;z-index:251670528;visibility:visible;mso-wrap-style:square;mso-wrap-distance-left:9pt;mso-wrap-distance-top:0;mso-wrap-distance-right:9pt;mso-wrap-distance-bottom:0;mso-position-horizontal:absolute;mso-position-horizontal-relative:text;mso-position-vertical:absolute;mso-position-vertical-relative:text;v-text-anchor:top" o:gfxdata="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" stroked="f">
+                <v:textbox style="mso-fit-shape-to-text:t" inset="0,0,0,0">
+                  <w:txbxContent>
+                    <w:p>
+                      <w:pPr>
+                        <w:pStyle w:val="Caption"/>
+                        <w:rPr>
+                          <w:b/>
+                          <w:noProof/>
+                          <w:sz w:val="28"/>
+                          <w:szCs w:val="28"/>
+                        </w:rPr>
+                      </w:pPr>
+                      <w:bookmarkStart w:id="5" w:name="_Toc221475776"/>
+                      <w:r>
+                        <w:t xml:space="preserve">Obrázok </w:t>
+                      </w:r>
+                      <w:fldSimple w:instr=" SEQ Obrázok \* ARABIC ">
+                        <w:r>
+                          <w:rPr>
+                            <w:noProof/>
+                          </w:rPr>
+                          <w:t>1</w:t>
+                        </w:r>
+                      </w:fldSimple>
+                      <w:r>
+                        <w:t xml:space="preserve"> </w:t>
+                      </w:r>
+                      <w:r>
+                        <w:t>Sekvenčný diagram autorizačného toku OAuth 2.0</w:t>
+                      </w:r>
+                      <w:bookmarkEnd w:id="5"/>
+                    </w:p>
+                  </w:txbxContent>
+                </v:textbox>
+                <w10:wrap type="square"/>
+              </v:shape>
+            </w:pict>
+          </mc:Fallback>
+        </mc:AlternateContent>
+      </w:r>
+      <w:r>
+        <w:rPr>
+          <w:noProof/>
+        </w:rPr>
+        <w:drawing>
+          <wp:anchor distT="0" distB="0" distL="114300" distR="114300" simplePos="0" relativeHeight="251661312" behindDoc="0" locked="0" layoutInCell="1" allowOverlap="1" wp14:anchorId="598CD257" wp14:editId="04E79E34">
+            <wp:simplePos x="0" y="0"/>
+            <wp:positionH relativeFrom="margin">
+              <wp:align>center</wp:align>
+            </wp:positionH>
+            <wp:positionV relativeFrom="paragraph">
+              <wp:posOffset>196850</wp:posOffset>
+            </wp:positionV>
+            <wp:extent cx="4185285" cy="2665730"/>
+            <wp:effectExtent l="0" t="0" r="5715" b="1270"/>
+            <wp:wrapSquare wrapText="bothSides"/>
+            <wp:docPr id="7" name="Picture 7"/>
+            <wp:cNvGraphicFramePr>
+              <a:graphicFrameLocks xmlns:a="http://schemas.openxmlformats.org/drawingml/2006/main" noChangeAspect="1"/>
+            </wp:cNvGraphicFramePr>
+            <a:graphic xmlns:a="http://schemas.openxmlformats.org/drawingml/2006/main">
+              <a:graphicData uri="http://schemas.openxmlformats.org/drawingml/2006/picture">
+                <pic:pic xmlns:pic="http://schemas.openxmlformats.org/drawingml/2006/picture">
+                  <pic:nvPicPr>
+                    <pic:cNvPr id="7" name="Picture 7"/>
+                    <pic:cNvPicPr/>
+                  </pic:nvPicPr>
+                  <pic:blipFill>
+                    <a:blip r:embed="rId13">
+                      <a:extLst>
+                        <a:ext uri="{28A0092B-C50C-407E-A947-70E740481C1C}">
+                          <a14:useLocalDpi xmlns:a14="http://schemas.microsoft.com/office/drawing/2010/main" val="0"/>
+                        </a:ext>
+                      </a:extLst>
+                    </a:blip>
+                    <a:stretch>
+                      <a:fillRect/>
+                    </a:stretch>
+                  </pic:blipFill>
+                  <pic:spPr>
+                    <a:xfrm>
+                      <a:off x="0" y="0"/>
+                      <a:ext cx="4185285" cy="2665730"/>
+                    </a:xfrm>
+                    <a:prstGeom prst="rect">
+                      <a:avLst/>
+                    </a:prstGeom>
+                  </pic:spPr>
+                </pic:pic>
+              </a:graphicData>
+            </a:graphic>
+            <wp14:sizeRelH relativeFrom="page">
+              <wp14:pctWidth>0</wp14:pctWidth>
+            </wp14:sizeRelH>
+            <wp14:sizeRelV relativeFrom="page">
+              <wp14:pctHeight>0</wp14:pctHeight>
+            </wp14:sizeRelV>
+          </wp:anchor>
+        </w:drawing>
+      </w:r>
+      <w:r>
+        <w:t>Správa tokenov</w:t>
+      </w:r>
+    </w:p>
+    <w:p>
+      <w:pPr>
+        <w:pStyle w:val="Heading4"/>
+      </w:pPr>
+      <w:r>
+        <w:t>Access Token</w:t>
+      </w:r>
+    </w:p>
+    <w:p>
+      <w:pPr>
+        <w:ind w:firstLine="708"/>
+      </w:pPr>
+      <w:r>
+        <w:t xml:space="preserve">Access token je krátkodobý JWT token, ktorý obsahuje identifikátor používateľa, jeho typ účtu a jedinečný identifikátor tokenu (jti). Token je podpísaný symetrickým </w:t>
+      </w:r>
+      <w:r>
+        <w:lastRenderedPageBreak/>
+        <w:t xml:space="preserve">kľúčom (HMAC SHA256) a je určený na autorizáciu volaní API. Po jeho expirácii </w:t>
+      </w:r>
+      <w:r>
+        <w:t>si</w:t>
+      </w:r>
+      <w:r>
+        <w:t xml:space="preserve"> klient môže</w:t>
+      </w:r>
+      <w:r>
+        <w:t xml:space="preserve"> vyžiadať nový pomocou</w:t>
+      </w:r>
+      <w:r>
+        <w:t xml:space="preserve"> refresh token</w:t>
+      </w:r>
+      <w:r>
+        <w:t>u</w:t>
+      </w:r>
+      <w:r>
+        <w:t>, ktorý je dlhodobejší a viazaný na konkrétne zariadenie.</w:t>
+      </w:r>
+    </w:p>
+    <w:p>
+      <w:pPr>
+        <w:pStyle w:val="Heading4"/>
+      </w:pPr>
+      <w:r>
+        <w:t>Refresh token</w:t>
+      </w:r>
+    </w:p>
+    <w:p>
+      <w:pPr>
+        <w:ind w:firstLine="708"/>
+      </w:pPr>
+      <w:r>
+        <w:t>Refresh token je generovaný ako náhodný 32-bytový token, hash</w:t>
+      </w:r>
+      <w:r>
+        <w:t>ovaný</w:t>
+      </w:r>
+      <w:r>
+        <w:t xml:space="preserve"> pomocou SHA-256 pred uložením do databázy. Každý refresh token je priradený ku konkrétnemu zariadeniu</w:t>
+      </w:r>
+      <w:r>
+        <w:t xml:space="preserve">, </w:t>
+      </w:r>
+      <w:r>
+        <w:t>teda</w:t>
+      </w:r>
+      <w:r>
+        <w:t xml:space="preserve"> obsahuje informácie o IP adrese, operačnom systéme, hardvérovej a sieťovej identite. Pri pokuse o obnovenie access tokenu server kontroluje zhod</w:t>
+      </w:r>
+      <w:r>
+        <w:t>u</w:t>
+      </w:r>
+      <w:r>
+        <w:t xml:space="preserve"> zariadenia, čím zabraňuje odcudzeniu tokenu a jeho zneužitiu na iných zariadeniach.</w:t>
+      </w:r>
+      <w:r>
+        <w:rPr>
+          <w:noProof/>
+        </w:rPr>
+        <w:t xml:space="preserve"> </w:t>
+      </w:r>
+    </w:p>
+    <w:p>
+      <w:pPr>
+        <w:ind w:firstLine="708"/>
+      </w:pPr>
+      <w:r>
+        <w:t>Systém podporuje aj revokáciu tokenov. Používateľ môže zrušiť</w:t>
+      </w:r>
+      <w:r>
+        <w:t xml:space="preserve"> prístup, buď konkrétnemu alebo všetkým zariadeniam</w:t>
+      </w:r>
+      <w:r>
+        <w:t xml:space="preserve">. Pri tomto kroku sa </w:t>
+      </w:r>
+      <w:r>
+        <w:t>vyžaduje dvojstupňové overenie</w:t>
+      </w:r>
+      <w:r>
+        <w:t>, ak je aktivovan</w:t>
+      </w:r>
+      <w:r>
+        <w:t>é</w:t>
+      </w:r>
+      <w:r>
+        <w:t>, aby sa zabránilo neoprávnenému prístupu.</w:t>
+      </w:r>
+    </w:p>
+    <w:p>
+      <w:pPr>
+        <w:pStyle w:val="Heading3"/>
+      </w:pPr>
+      <w:r>
+        <w:rPr>
+          <w:noProof/>
+        </w:rPr>
+        <mc:AlternateContent>
+          <mc:Choice Requires="wps">
+            <w:drawing>
+              <wp:anchor distT="0" distB="0" distL="114300" distR="114300" simplePos="0" relativeHeight="251672576" behindDoc="0" locked="0" layoutInCell="1" allowOverlap="1" wp14:anchorId="261C630B" wp14:editId="017AD797">
+                <wp:simplePos x="0" y="0"/>
+                <wp:positionH relativeFrom="column">
+                  <wp:posOffset>670560</wp:posOffset>
+                </wp:positionH>
+                <wp:positionV relativeFrom="paragraph">
+                  <wp:posOffset>1310640</wp:posOffset>
+                </wp:positionV>
+                <wp:extent cx="4057015" cy="635"/>
+                <wp:effectExtent l="0" t="0" r="0" b="0"/>
+                <wp:wrapSquare wrapText="bothSides"/>
+                <wp:docPr id="21" name="Text Box 21"/>
+                <wp:cNvGraphicFramePr/>
+                <a:graphic xmlns:a="http://schemas.openxmlformats.org/drawingml/2006/main">
+                  <a:graphicData uri="http://schemas.microsoft.com/office/word/2010/wordprocessingShape">
+                    <wps:wsp>
+                      <wps:cNvSpPr txBox="1"/>
+                      <wps:spPr>
+                        <a:xfrm>
+                          <a:off x="0" y="0"/>
+                          <a:ext cx="4057015" cy="635"/>
+                        </a:xfrm>
+                        <a:prstGeom prst="rect">
+                          <a:avLst/>
+                        </a:prstGeom>
+                        <a:solidFill>
+                          <a:prstClr val="white"/>
+                        </a:solidFill>
+                        <a:ln>
+                          <a:noFill/>
+                        </a:ln>
+                      </wps:spPr>
+                      <wps:txbx>
+                        <w:txbxContent>
+                          <w:p>
+                            <w:pPr>
+                              <w:pStyle w:val="Caption"/>
+                              <w:rPr>
+                                <w:b/>
+                                <w:noProof/>
+                                <w:sz w:val="28"/>
+                                <w:szCs w:val="28"/>
+                              </w:rPr>
+                            </w:pPr>
+                            <w:bookmarkStart w:id="6" w:name="_Toc221475777"/>
+                            <w:r>
+                              <w:t xml:space="preserve">Obrázok </w:t>
+                            </w:r>
+                            <w:fldSimple w:instr=" SEQ Obrázok \* ARABIC ">
+                              <w:r>
+                                <w:rPr>
+                                  <w:noProof/>
+                                </w:rPr>
+                                <w:t>2</w:t>
+                              </w:r>
+                            </w:fldSimple>
+                            <w:r>
+                              <w:t xml:space="preserve"> </w:t>
+                            </w:r>
+                            <w:r>
+                              <w:t>Lokálne uložený refresh token</w:t>
+                            </w:r>
+                            <w:bookmarkEnd w:id="6"/>
+                          </w:p>
+                        </w:txbxContent>
+                      </wps:txbx>
+                      <wps:bodyPr rot="0" spcFirstLastPara="0" vertOverflow="overflow" horzOverflow="overflow" vert="horz" wrap="square" lIns="0" tIns="0" rIns="0" bIns="0" numCol="1" spcCol="0" rtlCol="0" fromWordArt="0" anchor="t" anchorCtr="0" forceAA="0" compatLnSpc="1">
+                        <a:prstTxWarp prst="textNoShape">
+                          <a:avLst/>
+                        </a:prstTxWarp>
+                        <a:spAutoFit/>
+                      </wps:bodyPr>
+                    </wps:wsp>
+                  </a:graphicData>
+                </a:graphic>
+              </wp:anchor>
+            </w:drawing>
+          </mc:Choice>
+          <mc:Fallback>
+            <w:pict>
+              <v:shape w14:anchorId="261C630B" id="Text Box 21" o:spid="_x0000_s1027" type="#_x0000_t202" style="position:absolute;left:0;text-align:left;margin-left:52.8pt;margin-top:103.2pt;width:319.45pt;height:.05pt;z-index:251672576;visibility:visible;mso-wrap-style:square;mso-wrap-distance-left:9pt;mso-wrap-distance-top:0;mso-wrap-distance-right:9pt;mso-wrap-distance-bottom:0;mso-position-horizontal:absolute;mso-position-horizontal-relative:text;mso-position-vertical:absolute;mso-position-vertical-relative:text;v-text-anchor:top" o:gfxdata="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" stroked="f">
+                <v:textbox style="mso-fit-shape-to-text:t" inset="0,0,0,0">
+                  <w:txbxContent>
+                    <w:p>
+                      <w:pPr>
+                        <w:pStyle w:val="Caption"/>
+                        <w:rPr>
+                          <w:b/>
+                          <w:noProof/>
+                          <w:sz w:val="28"/>
+                          <w:szCs w:val="28"/>
+                        </w:rPr>
+                      </w:pPr>
+                      <w:bookmarkStart w:id="7" w:name="_Toc221475777"/>
+                      <w:r>
+                        <w:t xml:space="preserve">Obrázok </w:t>
+                      </w:r>
+                      <w:fldSimple w:instr=" SEQ Obrázok \* ARABIC ">
+                        <w:r>
+                          <w:rPr>
+                            <w:noProof/>
+                          </w:rPr>
+                          <w:t>2</w:t>
+                        </w:r>
+                      </w:fldSimple>
+                      <w:r>
+                        <w:t xml:space="preserve"> </w:t>
+                      </w:r>
+                      <w:r>
+                        <w:t>Lokálne uložený refresh token</w:t>
+                      </w:r>
+                      <w:bookmarkEnd w:id="7"/>
+                    </w:p>
+                  </w:txbxContent>
+                </v:textbox>
+                <w10:wrap type="square"/>
+              </v:shape>
+            </w:pict>
+          </mc:Fallback>
+        </mc:AlternateContent>
+      </w:r>
+      <w:r>
+        <w:rPr>
+          <w:noProof/>
+        </w:rPr>
+        <w:drawing>
+          <wp:anchor distT="0" distB="0" distL="114300" distR="114300" simplePos="0" relativeHeight="251660288" behindDoc="0" locked="0" layoutInCell="1" allowOverlap="1" wp14:anchorId="5B92A906" wp14:editId="67805471">
+            <wp:simplePos x="0" y="0"/>
+            <wp:positionH relativeFrom="margin">
+              <wp:align>center</wp:align>
+            </wp:positionH>
+            <wp:positionV relativeFrom="paragraph">
+              <wp:posOffset>196850</wp:posOffset>
+            </wp:positionV>
+            <wp:extent cx="4057015" cy="1056640"/>
+            <wp:effectExtent l="0" t="0" r="635" b="0"/>
+            <wp:wrapSquare wrapText="bothSides"/>
+            <wp:docPr id="6" name="Picture 6"/>
+            <wp:cNvGraphicFramePr>
+              <a:graphicFrameLocks xmlns:a="http://schemas.openxmlformats.org/drawingml/2006/main" noChangeAspect="1"/>
+            </wp:cNvGraphicFramePr>
+            <a:graphic xmlns:a="http://schemas.openxmlformats.org/drawingml/2006/main">
+              <a:graphicData uri="http://schemas.openxmlformats.org/drawingml/2006/picture">
+                <pic:pic xmlns:pic="http://schemas.openxmlformats.org/drawingml/2006/picture">
+                  <pic:nvPicPr>
+                    <pic:cNvPr id="1" name=""/>
+                    <pic:cNvPicPr/>
+                  </pic:nvPicPr>
+                  <pic:blipFill>
+                    <a:blip r:embed="rId14">
+                      <a:extLst>
+                        <a:ext uri="{28A0092B-C50C-407E-A947-70E740481C1C}">
+                          <a14:useLocalDpi xmlns:a14="http://schemas.microsoft.com/office/drawing/2010/main" val="0"/>
+                        </a:ext>
+                      </a:extLst>
+                    </a:blip>
+                    <a:stretch>
+                      <a:fillRect/>
+                    </a:stretch>
+                  </pic:blipFill>
+                  <pic:spPr>
+                    <a:xfrm>
+                      <a:off x="0" y="0"/>
+                      <a:ext cx="4057015" cy="1056640"/>
+                    </a:xfrm>
+                    <a:prstGeom prst="rect">
+                      <a:avLst/>
+                    </a:prstGeom>
+                  </pic:spPr>
+                </pic:pic>
+              </a:graphicData>
+            </a:graphic>
+            <wp14:sizeRelH relativeFrom="page">
+              <wp14:pctWidth>0</wp14:pctWidth>
+            </wp14:sizeRelH>
+            <wp14:sizeRelV relativeFrom="page">
+              <wp14:pctHeight>0</wp14:pctHeight>
+            </wp14:sizeRelV>
+          </wp:anchor>
+        </w:drawing>
+      </w:r>
+      <w:r>
+        <w:t>Dvojfaktorová autentifikácia (2FA)</w:t>
+      </w:r>
+    </w:p>
+    <w:p>
+      <w:pPr>
+        <w:ind w:firstLine="708"/>
+      </w:pPr>
+      <w:r>
+        <w:rPr>
+          <w:noProof/>
+        </w:rPr>
+        <mc:AlternateContent>
+          <mc:Choice Requires="wps">
+            <w:drawing>
+              <wp:anchor distT="0" distB="0" distL="114300" distR="114300" simplePos="0" relativeHeight="251668480" behindDoc="0" locked="0" layoutInCell="1" allowOverlap="1" wp14:anchorId="6894E063" wp14:editId="48C9390F">
+                <wp:simplePos x="0" y="0"/>
+                <wp:positionH relativeFrom="column">
+                  <wp:posOffset>259715</wp:posOffset>
+                </wp:positionH>
+                <wp:positionV relativeFrom="paragraph">
+                  <wp:posOffset>3104515</wp:posOffset>
+                </wp:positionV>
+                <wp:extent cx="4879975" cy="635"/>
+                <wp:effectExtent l="0" t="0" r="0" b="0"/>
+                <wp:wrapSquare wrapText="bothSides"/>
+                <wp:docPr id="19" name="Text Box 19"/>
+                <wp:cNvGraphicFramePr/>
+                <a:graphic xmlns:a="http://schemas.openxmlformats.org/drawingml/2006/main">
+                  <a:graphicData uri="http://schemas.microsoft.com/office/word/2010/wordprocessingShape">
+                    <wps:wsp>
+                      <wps:cNvSpPr txBox="1"/>
+                      <wps:spPr>
+                        <a:xfrm>
+                          <a:off x="0" y="0"/>
+                          <a:ext cx="4879975" cy="635"/>
+                        </a:xfrm>
+                        <a:prstGeom prst="rect">
+                          <a:avLst/>
+                        </a:prstGeom>
+                        <a:solidFill>
+                          <a:prstClr val="white"/>
+                        </a:solidFill>
+                        <a:ln>
+                          <a:noFill/>
+                        </a:ln>
+                      </wps:spPr>
+                      <wps:txbx>
+                        <w:txbxContent>
+                          <w:p>
+                            <w:pPr>
+                              <w:pStyle w:val="Caption"/>
+                              <w:rPr>
+                                <w:noProof/>
+                                <w:sz w:val="24"/>
+                                <w:szCs w:val="24"/>
+                              </w:rPr>
+                            </w:pPr>
+                            <w:bookmarkStart w:id="8" w:name="_Toc221475778"/>
+                            <w:r>
+                              <w:t xml:space="preserve">Obrázok </w:t>
+                            </w:r>
+                            <w:fldSimple w:instr=" SEQ Obrázok \* ARABIC ">
+                              <w:r>
+                                <w:rPr>
+                                  <w:noProof/>
+                                </w:rPr>
+                                <w:t>3</w:t>
+                              </w:r>
+                            </w:fldSimple>
+                            <w:r>
+                              <w:t xml:space="preserve"> </w:t>
+                            </w:r>
+                            <w:r>
+                              <w:t xml:space="preserve">Diagram procesu </w:t>
+                            </w:r>
+                            <w:r>
+                              <w:t>inicializácie</w:t>
+                            </w:r>
+                            <w:r>
+                              <w:t xml:space="preserve"> TOTP</w:t>
+                            </w:r>
+                            <w:bookmarkEnd w:id="8"/>
+                          </w:p>
+                        </w:txbxContent>
+                      </wps:txbx>
+                      <wps:bodyPr rot="0" spcFirstLastPara="0" vertOverflow="overflow" horzOverflow="overflow" vert="horz" wrap="square" lIns="0" tIns="0" rIns="0" bIns="0" numCol="1" spcCol="0" rtlCol="0" fromWordArt="0" anchor="t" anchorCtr="0" forceAA="0" compatLnSpc="1">
+                        <a:prstTxWarp prst="textNoShape">
+                          <a:avLst/>
+                        </a:prstTxWarp>
+                        <a:spAutoFit/>
+                      </wps:bodyPr>
+                    </wps:wsp>
+                  </a:graphicData>
+                </a:graphic>
+              </wp:anchor>
+            </w:drawing>
+          </mc:Choice>
+          <mc:Fallback>
+            <w:pict>
+              <v:shape w14:anchorId="6894E063" id="Text Box 19" o:spid="_x0000_s1028" type="#_x0000_t202" style="position:absolute;left:0;text-align:left;margin-left:20.45pt;margin-top:244.45pt;width:384.25pt;height:.05pt;z-index:251668480;visibility:visible;mso-wrap-style:square;mso-wrap-distance-left:9pt;mso-wrap-distance-top:0;mso-wrap-distance-right:9pt;mso-wrap-distance-bottom:0;mso-position-horizontal:absolute;mso-position-horizontal-relative:text;mso-position-vertical:absolute;mso-position-vertical-relative:text;v-text-anchor:top" o:gfxdata="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" stroked="f">
+                <v:textbox style="mso-fit-shape-to-text:t" inset="0,0,0,0">
+                  <w:txbxContent>
+                    <w:p>
+                      <w:pPr>
+                        <w:pStyle w:val="Caption"/>
+                        <w:rPr>
+                          <w:noProof/>
+                          <w:sz w:val="24"/>
+                          <w:szCs w:val="24"/>
+                        </w:rPr>
+                      </w:pPr>
+                      <w:bookmarkStart w:id="9" w:name="_Toc221475778"/>
+                      <w:r>
+                        <w:t xml:space="preserve">Obrázok </w:t>
+                      </w:r>
+                      <w:fldSimple w:instr=" SEQ Obrázok \* ARABIC ">
+                        <w:r>
+                          <w:rPr>
+                            <w:noProof/>
+                          </w:rPr>
+                          <w:t>3</w:t>
+                        </w:r>
+                      </w:fldSimple>
+                      <w:r>
+                        <w:t xml:space="preserve"> </w:t>
+                      </w:r>
+                      <w:r>
+                        <w:t xml:space="preserve">Diagram procesu </w:t>
+                      </w:r>
+                      <w:r>
+                        <w:t>inicializácie</w:t>
+                      </w:r>
+                      <w:r>
+                        <w:t xml:space="preserve"> TOTP</w:t>
+                      </w:r>
+                      <w:bookmarkEnd w:id="9"/>
+                    </w:p>
+                  </w:txbxContent>
+                </v:textbox>
+                <w10:wrap type="square"/>
+              </v:shape>
+            </w:pict>
+          </mc:Fallback>
+        </mc:AlternateContent>
+      </w:r>
+      <w:r>
+        <w:rPr>
+          <w:noProof/>
+        </w:rPr>
+        <w:drawing>
+          <wp:anchor distT="0" distB="0" distL="114300" distR="114300" simplePos="0" relativeHeight="251666432" behindDoc="0" locked="0" layoutInCell="1" allowOverlap="1" wp14:anchorId="3E9E403A" wp14:editId="2197A119">
+            <wp:simplePos x="0" y="0"/>
+            <wp:positionH relativeFrom="margin">
+              <wp:align>center</wp:align>
+            </wp:positionH>
+            <wp:positionV relativeFrom="paragraph">
+              <wp:posOffset>560439</wp:posOffset>
+            </wp:positionV>
+            <wp:extent cx="4879975" cy="2487295"/>
+            <wp:effectExtent l="0" t="0" r="0" b="8255"/>
+            <wp:wrapSquare wrapText="bothSides"/>
+            <wp:docPr id="15" name="Picture 15"/>
+            <wp:cNvGraphicFramePr>
+              <a:graphicFrameLocks xmlns:a="http://schemas.openxmlformats.org/drawingml/2006/main" noChangeAspect="1"/>
+            </wp:cNvGraphicFramePr>
+            <a:graphic xmlns:a="http://schemas.openxmlformats.org/drawingml/2006/main">
+              <a:graphicData uri="http://schemas.openxmlformats.org/drawingml/2006/picture">
+                <pic:pic xmlns:pic="http://schemas.openxmlformats.org/drawingml/2006/picture">
+                  <pic:nvPicPr>
+                    <pic:cNvPr id="15" name="Picture 15"/>
+                    <pic:cNvPicPr/>
+                  </pic:nvPicPr>
+                  <pic:blipFill rotWithShape="1">
+                    <a:blip r:embed="rId15" cstate="print">
+                      <a:extLst>
+                        <a:ext uri="{28A0092B-C50C-407E-A947-70E740481C1C}">
+                          <a14:useLocalDpi xmlns:a14="http://schemas.microsoft.com/office/drawing/2010/main" val="0"/>
+                        </a:ext>
+                      </a:extLst>
+                    </a:blip>
+                    <a:srcRect t="15093" b="8422"/>
+                    <a:stretch/>
+                  </pic:blipFill>
+                  <pic:spPr bwMode="auto">
+                    <a:xfrm>
+                      <a:off x="0" y="0"/>
+                      <a:ext cx="4879975" cy="2487295"/>
+                    </a:xfrm>
+                    <a:prstGeom prst="rect">
+                      <a:avLst/>
+                    </a:prstGeom>
+                    <a:ln>
+                      <a:noFill/>
+                    </a:ln>
+                    <a:extLst>
+                      <a:ext uri="{53640926-AAD7-44D8-BBD7-CCE9431645EC}">
+                        <a14:shadowObscured xmlns:a14="http://schemas.microsoft.com/office/drawing/2010/main"/>
+                      </a:ext>
+                    </a:extLst>
+                  </pic:spPr>
+                </pic:pic>
+              </a:graphicData>
+            </a:graphic>
+            <wp14:sizeRelH relativeFrom="page">
+              <wp14:pctWidth>0</wp14:pctWidth>
+            </wp14:sizeRelH>
+            <wp14:sizeRelV relativeFrom="page">
+              <wp14:pctHeight>0</wp14:pctHeight>
+            </wp14:sizeRelV>
+          </wp:anchor>
+        </w:drawing>
+      </w:r>
+      <w:r>
+        <w:t xml:space="preserve">Implementácia </w:t>
+      </w:r>
+      <w:r>
+        <w:t xml:space="preserve">procesu </w:t>
+      </w:r>
+      <w:r>
+        <w:t>dvojstupňového overenia</w:t>
+      </w:r>
+      <w:r>
+        <w:t xml:space="preserve"> pozostáva z</w:t>
+      </w:r>
+      <w:r>
+        <w:t xml:space="preserve"> inicializácie, overenia a správy záložných kódov</w:t>
+      </w:r>
+      <w:r>
+        <w:t>.</w:t>
+      </w:r>
+    </w:p>
+    <w:p>
+      <w:pPr>
+        <w:pStyle w:val="Heading4"/>
+      </w:pPr>
+      <w:r>
+        <w:lastRenderedPageBreak/>
+        <w:t>Inicializácia</w:t>
+      </w:r>
+    </w:p>
+    <w:p>
+      <w:pPr>
+        <w:ind w:firstLine="708"/>
+      </w:pPr>
+      <w:r>
+        <w:t xml:space="preserve">Server </w:t>
+      </w:r>
+      <w:r>
+        <w:t>vy</w:t>
+      </w:r>
+      <w:r>
+        <w:t>generuje tajný kľúč, kód</w:t>
+      </w:r>
+      <w:r>
+        <w:t>uje</w:t>
+      </w:r>
+      <w:r>
+        <w:t xml:space="preserve"> do Base32 a</w:t>
+      </w:r>
+      <w:r>
+        <w:t xml:space="preserve"> následne </w:t>
+      </w:r>
+      <w:r>
+        <w:t>v</w:t>
+      </w:r>
+      <w:r>
+        <w:t>kladá</w:t>
+      </w:r>
+      <w:r>
+        <w:t xml:space="preserve"> do URI formátu </w:t>
+      </w:r>
+      <w:r>
+        <w:rPr>
+          <w:i/>
+          <w:iCs/>
+        </w:rPr>
+        <w:t>otpauth://totp</w:t>
+      </w:r>
+      <w:r>
+        <w:t>. Klient na základe tohto URI vygeneruje QR kód, ktorý používateľ naskenuje do svojej aplikácie</w:t>
+      </w:r>
+      <w:r>
+        <w:t xml:space="preserve">, ktorá </w:t>
+      </w:r>
+      <w:r>
+        <w:t xml:space="preserve">umožňuje </w:t>
+      </w:r>
+      <w:r>
+        <w:t>sprav</w:t>
+      </w:r>
+      <w:r>
+        <w:t>ovať</w:t>
+      </w:r>
+      <w:r>
+        <w:t xml:space="preserve"> kódy dvojstupňového overenia</w:t>
+      </w:r>
+      <w:r>
+        <w:t>.</w:t>
+      </w:r>
+    </w:p>
+    <w:p>
+      <w:pPr>
+        <w:pStyle w:val="Heading4"/>
+      </w:pPr>
+      <w:r>
+        <w:t>Overenie</w:t>
+      </w:r>
+    </w:p>
+    <w:p>
+      <w:pPr>
+        <w:ind w:firstLine="708"/>
+      </w:pPr>
+      <w:r>
+        <w:t xml:space="preserve">Používateľ zadáva jednorazový kód, ktorý klient odosiela na server. Server dešifruje uložený </w:t>
+      </w:r>
+      <w:r>
+        <w:t>tajný kľúč</w:t>
+      </w:r>
+      <w:r>
+        <w:t xml:space="preserve"> a overuje kód. Ak je kód platný, </w:t>
+      </w:r>
+      <w:r>
+        <w:t>overenie</w:t>
+      </w:r>
+      <w:r>
+        <w:t xml:space="preserve"> sa považuje za</w:t>
+      </w:r>
+      <w:r>
+        <w:t xml:space="preserve"> úspešné</w:t>
+      </w:r>
+      <w:r>
+        <w:t>.</w:t>
+      </w:r>
+    </w:p>
+    <w:p>
+      <w:pPr>
+        <w:pStyle w:val="Heading4"/>
+      </w:pPr>
+      <w:r>
+        <w:t>Záložné kódy</w:t>
+      </w:r>
+    </w:p>
+    <w:p>
+      <w:pPr>
+        <w:ind w:firstLine="708"/>
+      </w:pPr>
+      <w:r>
+        <w:t>Pre prípad straty zariadenia systém umožňuje generovať jednorazové záložné kódy. Kódy sú hashované pomocou SHA-256 a uložené v databáze. Každý kód je možné použiť iba raz, pričom systém podporuje</w:t>
+      </w:r>
+      <w:r>
+        <w:t xml:space="preserve"> definovaný časový limit</w:t>
+      </w:r>
+      <w:r>
+        <w:t xml:space="preserve"> medzi generáciami, aby sa zabránilo zneužitiu.</w:t>
+      </w:r>
+    </w:p>
     <w:sectPr>
+      <w:footerReference w:type="default" r:id="rId16"/>
       <w:pgSz w:w="11906" w:h="16838" w:code="9"/>
       <w:pgMar w:top="1418" w:right="1418" w:bottom="1418" w:left="1985" w:header="851" w:footer="851" w:gutter="0"/>
       <w:cols w:space="708"/>
@@ -2549,6 +4787,81 @@
     </w:p>
   </w:endnote>
 </w:endnotes>
+</file>
+
+<file path=word/footer1.xml><?xml version="1.0" encoding="utf-8"?>
+<w:ftr xmlns:wpc="http://schemas.microsoft.com/office/word/2010/wordprocessingCanvas" xmlns:cx="http://schemas.microsoft.com/office/drawing/2014/chartex" xmlns:cx1="http://schemas.microsoft.com/office/drawing/2015/9/8/chartex" xmlns:cx2="http://schemas.microsoft.com/office/drawing/2015/10/21/chartex" xmlns:cx3="http://schemas.microsoft.com/office/drawing/2016/5/9/chartex" xmlns:cx4="http://schemas.microsoft.com/office/drawing/2016/5/10/chartex" xmlns:cx5="http://schemas.microsoft.com/office/drawing/2016/5/11/chartex" xmlns:cx6="http://schemas.microsoft.com/office/drawing/2016/5/12/chartex" xmlns:cx7="http://schemas.microsoft.com/office/drawing/2016/5/13/chartex" xmlns:cx8="http://schemas.microsoft.com/office/drawing/2016/5/14/chartex" xmlns:mc="http://schemas.openxmlformats.org/markup-compatibility/2006" xmlns:aink="http://schemas.microsoft.com/office/drawing/2016/ink" xmlns:am3d="http://schemas.microsoft.com/office/drawing/2017/model3d" xmlns:o="urn:schemas-microsoft-com:office:office" xmlns:r="http://schemas.openxmlformats.org/officeDocument/2006/relationships" xmlns:m="http://schemas.openxmlformats.org/officeDocument/2006/math" xmlns:v="urn:schemas-microsoft-com:vml" xmlns:wp14="http://schemas.microsoft.com/office/word/2010/wordprocessingDrawing" xmlns:wp="http://schemas.openxmlformats.org/drawingml/2006/wordprocessingDrawing" xmlns:w10="urn:schemas-microsoft-com:office:word" xmlns:w="http://schemas.openxmlformats.org/wordprocessingml/2006/main" xmlns:w14="http://schemas.microsoft.com/office/word/2010/wordml" xmlns:w15="http://schemas.microsoft.com/office/word/2012/wordml" xmlns:w16cex="http://schemas.microsoft.com/office/word/2018/wordml/cex" xmlns:w16cid="http://schemas.microsoft.com/office/word/2016/wordml/cid" xmlns:w16="http://schemas.microsoft.com/office/word/2018/wordml" xmlns:w16sdtdh="http://schemas.microsoft.com/office/word/2020/wordml/sdtdatahash" xmlns:w16se="http://schemas.microsoft.com/office/word/2015/wordml/symex" xmlns:wpg="http://schemas.microsoft.com/office/word/2010/wordprocessingGroup" xmlns:wpi="http://schemas.microsoft.com/office/word/2010/wordprocessingInk" xmlns:wne="http://schemas.microsoft.com/office/word/2006/wordml" xmlns:wps="http://schemas.microsoft.com/office/word/2010/wordprocessingShape" mc:Ignorable="w14 w15 w16se w16cid w16 w16cex w16sdtdh wp14">
+  <w:p>
+    <w:pPr>
+      <w:pStyle w:val="Footer"/>
+      <w:jc w:val="center"/>
+    </w:pPr>
+  </w:p>
+  <w:p>
+    <w:pPr>
+      <w:pStyle w:val="Footer"/>
+      <w:rPr>
+        <w:lang w:val="en-US"/>
+      </w:rPr>
+    </w:pPr>
+  </w:p>
+</w:ftr>
+</file>
+
+<file path=word/footer2.xml><?xml version="1.0" encoding="utf-8"?>
+<w:ftr xmlns:wpc="http://schemas.microsoft.com/office/word/2010/wordprocessingCanvas" xmlns:cx="http://schemas.microsoft.com/office/drawing/2014/chartex" xmlns:cx1="http://schemas.microsoft.com/office/drawing/2015/9/8/chartex" xmlns:cx2="http://schemas.microsoft.com/office/drawing/2015/10/21/chartex" xmlns:cx3="http://schemas.microsoft.com/office/drawing/2016/5/9/chartex" xmlns:cx4="http://schemas.microsoft.com/office/drawing/2016/5/10/chartex" xmlns:cx5="http://schemas.microsoft.com/office/drawing/2016/5/11/chartex" xmlns:cx6="http://schemas.microsoft.com/office/drawing/2016/5/12/chartex" xmlns:cx7="http://schemas.microsoft.com/office/drawing/2016/5/13/chartex" xmlns:cx8="http://schemas.microsoft.com/office/drawing/2016/5/14/chartex" xmlns:mc="http://schemas.openxmlformats.org/markup-compatibility/2006" xmlns:aink="http://schemas.microsoft.com/office/drawing/2016/ink" xmlns:am3d="http://schemas.microsoft.com/office/drawing/2017/model3d" xmlns:o="urn:schemas-microsoft-com:office:office" xmlns:r="http://schemas.openxmlformats.org/officeDocument/2006/relationships" xmlns:m="http://schemas.openxmlformats.org/officeDocument/2006/math" xmlns:v="urn:schemas-microsoft-com:vml" xmlns:wp14="http://schemas.microsoft.com/office/word/2010/wordprocessingDrawing" xmlns:wp="http://schemas.openxmlformats.org/drawingml/2006/wordprocessingDrawing" xmlns:w10="urn:schemas-microsoft-com:office:word" xmlns:w="http://schemas.openxmlformats.org/wordprocessingml/2006/main" xmlns:w14="http://schemas.microsoft.com/office/word/2010/wordml" xmlns:w15="http://schemas.microsoft.com/office/word/2012/wordml" xmlns:w16cex="http://schemas.microsoft.com/office/word/2018/wordml/cex" xmlns:w16cid="http://schemas.microsoft.com/office/word/2016/wordml/cid" xmlns:w16="http://schemas.microsoft.com/office/word/2018/wordml" xmlns:w16sdtdh="http://schemas.microsoft.com/office/word/2020/wordml/sdtdatahash" xmlns:w16se="http://schemas.microsoft.com/office/word/2015/wordml/symex" xmlns:wpg="http://schemas.microsoft.com/office/word/2010/wordprocessingGroup" xmlns:wpi="http://schemas.microsoft.com/office/word/2010/wordprocessingInk" xmlns:wne="http://schemas.microsoft.com/office/word/2006/wordml" xmlns:wps="http://schemas.microsoft.com/office/word/2010/wordprocessingShape" mc:Ignorable="w14 w15 w16se w16cid w16 w16cex w16sdtdh wp14">
+  <w:sdt>
+    <w:sdtPr>
+      <w:id w:val="-856810150"/>
+      <w:docPartObj>
+        <w:docPartGallery w:val="Page Numbers (Bottom of Page)"/>
+        <w:docPartUnique/>
+      </w:docPartObj>
+    </w:sdtPr>
+    <w:sdtEndPr>
+      <w:rPr>
+        <w:noProof/>
+      </w:rPr>
+    </w:sdtEndPr>
+    <w:sdtContent>
+      <w:p>
+        <w:pPr>
+          <w:pStyle w:val="Footer"/>
+          <w:jc w:val="center"/>
+        </w:pPr>
+        <w:r>
+          <w:fldChar w:fldCharType="begin"/>
+        </w:r>
+        <w:r>
+          <w:instrText xml:space="preserve"> PAGE   \* MERGEFORMAT </w:instrText>
+        </w:r>
+        <w:r>
+          <w:fldChar w:fldCharType="separate"/>
+        </w:r>
+        <w:r>
+          <w:rPr>
+            <w:noProof/>
+          </w:rPr>
+          <w:t>2</w:t>
+        </w:r>
+        <w:r>
+          <w:rPr>
+            <w:noProof/>
+          </w:rPr>
+          <w:fldChar w:fldCharType="end"/>
+        </w:r>
+      </w:p>
+    </w:sdtContent>
+  </w:sdt>
+  <w:p>
+    <w:pPr>
+      <w:pStyle w:val="Footer"/>
+      <w:rPr>
+        <w:lang w:val="en-US"/>
+      </w:rPr>
+    </w:pPr>
+  </w:p>
+</w:ftr>
 </file>
 
 <file path=word/footnotes.xml><?xml version="1.0" encoding="utf-8"?>
@@ -2665,6 +4978,232 @@
     </w:lvl>
   </w:abstractNum>
   <w:abstractNum w:abstractNumId="1" w15:restartNumberingAfterBreak="0">
+    <w:nsid w:val="271763CC"/>
+    <w:multiLevelType w:val="hybridMultilevel"/>
+    <w:tmpl w:val="8F0898B2"/>
+    <w:lvl w:ilvl="0" w:tplc="04090001">
+      <w:start w:val="1"/>
+      <w:numFmt w:val="bullet"/>
+      <w:lvlText w:val=""/>
+      <w:lvlJc w:val="left"/>
+      <w:pPr>
+        <w:ind w:left="720" w:hanging="360"/>
+      </w:pPr>
+      <w:rPr>
+        <w:rFonts w:ascii="Symbol" w:hAnsi="Symbol" w:hint="default"/>
+      </w:rPr>
+    </w:lvl>
+    <w:lvl w:ilvl="1" w:tplc="04090003" w:tentative="1">
+      <w:start w:val="1"/>
+      <w:numFmt w:val="bullet"/>
+      <w:lvlText w:val="o"/>
+      <w:lvlJc w:val="left"/>
+      <w:pPr>
+        <w:ind w:left="1440" w:hanging="360"/>
+      </w:pPr>
+      <w:rPr>
+        <w:rFonts w:ascii="Courier New" w:hAnsi="Courier New" w:cs="Courier New" w:hint="default"/>
+      </w:rPr>
+    </w:lvl>
+    <w:lvl w:ilvl="2" w:tplc="04090005" w:tentative="1">
+      <w:start w:val="1"/>
+      <w:numFmt w:val="bullet"/>
+      <w:lvlText w:val=""/>
+      <w:lvlJc w:val="left"/>
+      <w:pPr>
+        <w:ind w:left="2160" w:hanging="360"/>
+      </w:pPr>
+      <w:rPr>
+        <w:rFonts w:ascii="Wingdings" w:hAnsi="Wingdings" w:hint="default"/>
+      </w:rPr>
+    </w:lvl>
+    <w:lvl w:ilvl="3" w:tplc="04090001" w:tentative="1">
+      <w:start w:val="1"/>
+      <w:numFmt w:val="bullet"/>
+      <w:lvlText w:val=""/>
+      <w:lvlJc w:val="left"/>
+      <w:pPr>
+        <w:ind w:left="2880" w:hanging="360"/>
+      </w:pPr>
+      <w:rPr>
+        <w:rFonts w:ascii="Symbol" w:hAnsi="Symbol" w:hint="default"/>
+      </w:rPr>
+    </w:lvl>
+    <w:lvl w:ilvl="4" w:tplc="04090003" w:tentative="1">
+      <w:start w:val="1"/>
+      <w:numFmt w:val="bullet"/>
+      <w:lvlText w:val="o"/>
+      <w:lvlJc w:val="left"/>
+      <w:pPr>
+        <w:ind w:left="3600" w:hanging="360"/>
+      </w:pPr>
+      <w:rPr>
+        <w:rFonts w:ascii="Courier New" w:hAnsi="Courier New" w:cs="Courier New" w:hint="default"/>
+      </w:rPr>
+    </w:lvl>
+    <w:lvl w:ilvl="5" w:tplc="04090005" w:tentative="1">
+      <w:start w:val="1"/>
+      <w:numFmt w:val="bullet"/>
+      <w:lvlText w:val=""/>
+      <w:lvlJc w:val="left"/>
+      <w:pPr>
+        <w:ind w:left="4320" w:hanging="360"/>
+      </w:pPr>
+      <w:rPr>
+        <w:rFonts w:ascii="Wingdings" w:hAnsi="Wingdings" w:hint="default"/>
+      </w:rPr>
+    </w:lvl>
+    <w:lvl w:ilvl="6" w:tplc="04090001" w:tentative="1">
+      <w:start w:val="1"/>
+      <w:numFmt w:val="bullet"/>
+      <w:lvlText w:val=""/>
+      <w:lvlJc w:val="left"/>
+      <w:pPr>
+        <w:ind w:left="5040" w:hanging="360"/>
+      </w:pPr>
+      <w:rPr>
+        <w:rFonts w:ascii="Symbol" w:hAnsi="Symbol" w:hint="default"/>
+      </w:rPr>
+    </w:lvl>
+    <w:lvl w:ilvl="7" w:tplc="04090003" w:tentative="1">
+      <w:start w:val="1"/>
+      <w:numFmt w:val="bullet"/>
+      <w:lvlText w:val="o"/>
+      <w:lvlJc w:val="left"/>
+      <w:pPr>
+        <w:ind w:left="5760" w:hanging="360"/>
+      </w:pPr>
+      <w:rPr>
+        <w:rFonts w:ascii="Courier New" w:hAnsi="Courier New" w:cs="Courier New" w:hint="default"/>
+      </w:rPr>
+    </w:lvl>
+    <w:lvl w:ilvl="8" w:tplc="04090005" w:tentative="1">
+      <w:start w:val="1"/>
+      <w:numFmt w:val="bullet"/>
+      <w:lvlText w:val=""/>
+      <w:lvlJc w:val="left"/>
+      <w:pPr>
+        <w:ind w:left="6480" w:hanging="360"/>
+      </w:pPr>
+      <w:rPr>
+        <w:rFonts w:ascii="Wingdings" w:hAnsi="Wingdings" w:hint="default"/>
+      </w:rPr>
+    </w:lvl>
+  </w:abstractNum>
+  <w:abstractNum w:abstractNumId="2" w15:restartNumberingAfterBreak="0">
+    <w:nsid w:val="34ED1DD1"/>
+    <w:multiLevelType w:val="hybridMultilevel"/>
+    <w:tmpl w:val="396E7A3C"/>
+    <w:lvl w:ilvl="0" w:tplc="04090001">
+      <w:start w:val="1"/>
+      <w:numFmt w:val="bullet"/>
+      <w:lvlText w:val=""/>
+      <w:lvlJc w:val="left"/>
+      <w:pPr>
+        <w:ind w:left="720" w:hanging="360"/>
+      </w:pPr>
+      <w:rPr>
+        <w:rFonts w:ascii="Symbol" w:hAnsi="Symbol" w:hint="default"/>
+      </w:rPr>
+    </w:lvl>
+    <w:lvl w:ilvl="1" w:tplc="04090003" w:tentative="1">
+      <w:start w:val="1"/>
+      <w:numFmt w:val="bullet"/>
+      <w:lvlText w:val="o"/>
+      <w:lvlJc w:val="left"/>
+      <w:pPr>
+        <w:ind w:left="1440" w:hanging="360"/>
+      </w:pPr>
+      <w:rPr>
+        <w:rFonts w:ascii="Courier New" w:hAnsi="Courier New" w:cs="Courier New" w:hint="default"/>
+      </w:rPr>
+    </w:lvl>
+    <w:lvl w:ilvl="2" w:tplc="04090005" w:tentative="1">
+      <w:start w:val="1"/>
+      <w:numFmt w:val="bullet"/>
+      <w:lvlText w:val=""/>
+      <w:lvlJc w:val="left"/>
+      <w:pPr>
+        <w:ind w:left="2160" w:hanging="360"/>
+      </w:pPr>
+      <w:rPr>
+        <w:rFonts w:ascii="Wingdings" w:hAnsi="Wingdings" w:hint="default"/>
+      </w:rPr>
+    </w:lvl>
+    <w:lvl w:ilvl="3" w:tplc="04090001" w:tentative="1">
+      <w:start w:val="1"/>
+      <w:numFmt w:val="bullet"/>
+      <w:lvlText w:val=""/>
+      <w:lvlJc w:val="left"/>
+      <w:pPr>
+        <w:ind w:left="2880" w:hanging="360"/>
+      </w:pPr>
+      <w:rPr>
+        <w:rFonts w:ascii="Symbol" w:hAnsi="Symbol" w:hint="default"/>
+      </w:rPr>
+    </w:lvl>
+    <w:lvl w:ilvl="4" w:tplc="04090003" w:tentative="1">
+      <w:start w:val="1"/>
+      <w:numFmt w:val="bullet"/>
+      <w:lvlText w:val="o"/>
+      <w:lvlJc w:val="left"/>
+      <w:pPr>
+        <w:ind w:left="3600" w:hanging="360"/>
+      </w:pPr>
+      <w:rPr>
+        <w:rFonts w:ascii="Courier New" w:hAnsi="Courier New" w:cs="Courier New" w:hint="default"/>
+      </w:rPr>
+    </w:lvl>
+    <w:lvl w:ilvl="5" w:tplc="04090005" w:tentative="1">
+      <w:start w:val="1"/>
+      <w:numFmt w:val="bullet"/>
+      <w:lvlText w:val=""/>
+      <w:lvlJc w:val="left"/>
+      <w:pPr>
+        <w:ind w:left="4320" w:hanging="360"/>
+      </w:pPr>
+      <w:rPr>
+        <w:rFonts w:ascii="Wingdings" w:hAnsi="Wingdings" w:hint="default"/>
+      </w:rPr>
+    </w:lvl>
+    <w:lvl w:ilvl="6" w:tplc="04090001" w:tentative="1">
+      <w:start w:val="1"/>
+      <w:numFmt w:val="bullet"/>
+      <w:lvlText w:val=""/>
+      <w:lvlJc w:val="left"/>
+      <w:pPr>
+        <w:ind w:left="5040" w:hanging="360"/>
+      </w:pPr>
+      <w:rPr>
+        <w:rFonts w:ascii="Symbol" w:hAnsi="Symbol" w:hint="default"/>
+      </w:rPr>
+    </w:lvl>
+    <w:lvl w:ilvl="7" w:tplc="04090003" w:tentative="1">
+      <w:start w:val="1"/>
+      <w:numFmt w:val="bullet"/>
+      <w:lvlText w:val="o"/>
+      <w:lvlJc w:val="left"/>
+      <w:pPr>
+        <w:ind w:left="5760" w:hanging="360"/>
+      </w:pPr>
+      <w:rPr>
+        <w:rFonts w:ascii="Courier New" w:hAnsi="Courier New" w:cs="Courier New" w:hint="default"/>
+      </w:rPr>
+    </w:lvl>
+    <w:lvl w:ilvl="8" w:tplc="04090005" w:tentative="1">
+      <w:start w:val="1"/>
+      <w:numFmt w:val="bullet"/>
+      <w:lvlText w:val=""/>
+      <w:lvlJc w:val="left"/>
+      <w:pPr>
+        <w:ind w:left="6480" w:hanging="360"/>
+      </w:pPr>
+      <w:rPr>
+        <w:rFonts w:ascii="Wingdings" w:hAnsi="Wingdings" w:hint="default"/>
+      </w:rPr>
+    </w:lvl>
+  </w:abstractNum>
+  <w:abstractNum w:abstractNumId="3" w15:restartNumberingAfterBreak="0">
     <w:nsid w:val="41F0479B"/>
     <w:multiLevelType w:val="multilevel"/>
     <w:tmpl w:val="04090025"/>
@@ -2763,7 +5302,13 @@
     <w:abstractNumId w:val="0"/>
   </w:num>
   <w:num w:numId="2">
+    <w:abstractNumId w:val="3"/>
+  </w:num>
+  <w:num w:numId="3">
     <w:abstractNumId w:val="1"/>
+  </w:num>
+  <w:num w:numId="4">
+    <w:abstractNumId w:val="2"/>
   </w:num>
 </w:numbering>
 </file>
@@ -3182,14 +5727,14 @@
     <w:link w:val="Heading1Char"/>
     <w:uiPriority w:val="9"/>
     <w:qFormat/>
-    <w:rsid w:val="004D05A3"/>
+    <w:rsid w:val="00DA3C8F"/>
     <w:pPr>
       <w:keepNext/>
       <w:keepLines/>
       <w:numPr>
         <w:numId w:val="2"/>
       </w:numPr>
-      <w:spacing w:line="240" w:lineRule="auto"/>
+      <w:spacing w:after="240" w:line="240" w:lineRule="auto"/>
       <w:ind w:left="0" w:firstLine="0"/>
       <w:outlineLvl w:val="0"/>
     </w:pPr>
@@ -3209,7 +5754,7 @@
     <w:uiPriority w:val="9"/>
     <w:unhideWhenUsed/>
     <w:qFormat/>
-    <w:rsid w:val="004D05A3"/>
+    <w:rsid w:val="00DA3C8F"/>
     <w:pPr>
       <w:keepNext/>
       <w:keepLines/>
@@ -3217,7 +5762,7 @@
         <w:ilvl w:val="1"/>
         <w:numId w:val="2"/>
       </w:numPr>
-      <w:spacing w:line="240" w:lineRule="auto"/>
+      <w:spacing w:after="240" w:line="240" w:lineRule="auto"/>
       <w:ind w:left="0" w:firstLine="0"/>
       <w:outlineLvl w:val="1"/>
     </w:pPr>
@@ -3234,10 +5779,9 @@
     <w:next w:val="Normal"/>
     <w:link w:val="Heading3Char"/>
     <w:uiPriority w:val="9"/>
-    <w:semiHidden/>
     <w:unhideWhenUsed/>
     <w:qFormat/>
-    <w:rsid w:val="004D05A3"/>
+    <w:rsid w:val="00F96564"/>
     <w:pPr>
       <w:keepNext/>
       <w:keepLines/>
@@ -3245,7 +5789,7 @@
         <w:ilvl w:val="2"/>
         <w:numId w:val="2"/>
       </w:numPr>
-      <w:spacing w:line="240" w:lineRule="auto"/>
+      <w:spacing w:after="240" w:line="240" w:lineRule="auto"/>
       <w:ind w:left="0" w:firstLine="0"/>
       <w:outlineLvl w:val="2"/>
     </w:pPr>
@@ -3262,10 +5806,9 @@
     <w:next w:val="Normal"/>
     <w:link w:val="Heading4Char"/>
     <w:uiPriority w:val="9"/>
-    <w:semiHidden/>
     <w:unhideWhenUsed/>
     <w:qFormat/>
-    <w:rsid w:val="001A70FC"/>
+    <w:rsid w:val="006D3A7B"/>
     <w:pPr>
       <w:keepNext/>
       <w:keepLines/>
@@ -3273,14 +5816,15 @@
         <w:ilvl w:val="3"/>
         <w:numId w:val="2"/>
       </w:numPr>
-      <w:spacing w:before="80" w:after="40"/>
+      <w:spacing w:after="240" w:line="240" w:lineRule="auto"/>
+      <w:ind w:left="0" w:firstLine="0"/>
       <w:outlineLvl w:val="3"/>
     </w:pPr>
     <w:rPr>
       <w:rFonts w:eastAsiaTheme="majorEastAsia" w:cstheme="majorBidi"/>
-      <w:i/>
+      <w:b/>
       <w:iCs/>
-      <w:color w:val="0F4761" w:themeColor="accent1" w:themeShade="BF"/>
+      <w:sz w:val="28"/>
     </w:rPr>
   </w:style>
   <w:style w:type="paragraph" w:styleId="Heading5">
@@ -3444,7 +5988,7 @@
     <w:basedOn w:val="DefaultParagraphFont"/>
     <w:link w:val="Heading1"/>
     <w:uiPriority w:val="9"/>
-    <w:rsid w:val="004D05A3"/>
+    <w:rsid w:val="00DA3C8F"/>
     <w:rPr>
       <w:rFonts w:ascii="Times New Roman" w:eastAsiaTheme="majorEastAsia" w:hAnsi="Times New Roman" w:cstheme="majorBidi"/>
       <w:b/>
@@ -3458,7 +6002,7 @@
     <w:basedOn w:val="DefaultParagraphFont"/>
     <w:link w:val="Heading2"/>
     <w:uiPriority w:val="9"/>
-    <w:rsid w:val="004D05A3"/>
+    <w:rsid w:val="00DA3C8F"/>
     <w:rPr>
       <w:rFonts w:ascii="Times New Roman" w:eastAsiaTheme="majorEastAsia" w:hAnsi="Times New Roman" w:cstheme="majorBidi"/>
       <w:b/>
@@ -3471,8 +6015,7 @@
     <w:basedOn w:val="DefaultParagraphFont"/>
     <w:link w:val="Heading3"/>
     <w:uiPriority w:val="9"/>
-    <w:semiHidden/>
-    <w:rsid w:val="004D05A3"/>
+    <w:rsid w:val="00F96564"/>
     <w:rPr>
       <w:rFonts w:ascii="Times New Roman" w:eastAsiaTheme="majorEastAsia" w:hAnsi="Times New Roman" w:cstheme="majorBidi"/>
       <w:b/>
@@ -3485,13 +6028,12 @@
     <w:basedOn w:val="DefaultParagraphFont"/>
     <w:link w:val="Heading4"/>
     <w:uiPriority w:val="9"/>
-    <w:semiHidden/>
-    <w:rsid w:val="001A70FC"/>
+    <w:rsid w:val="006D3A7B"/>
     <w:rPr>
-      <w:rFonts w:eastAsiaTheme="majorEastAsia" w:cstheme="majorBidi"/>
-      <w:i/>
+      <w:rFonts w:ascii="Times New Roman" w:eastAsiaTheme="majorEastAsia" w:hAnsi="Times New Roman" w:cstheme="majorBidi"/>
+      <w:b/>
       <w:iCs/>
-      <w:color w:val="0F4761" w:themeColor="accent1" w:themeShade="BF"/>
+      <w:sz w:val="28"/>
     </w:rPr>
   </w:style>
   <w:style w:type="character" w:customStyle="1" w:styleId="Heading5Char">
@@ -3790,6 +6332,46 @@
     <w:uiPriority w:val="37"/>
     <w:unhideWhenUsed/>
     <w:rsid w:val="006674DD"/>
+  </w:style>
+  <w:style w:type="paragraph" w:styleId="Caption">
+    <w:name w:val="caption"/>
+    <w:basedOn w:val="Normal"/>
+    <w:next w:val="Normal"/>
+    <w:uiPriority w:val="35"/>
+    <w:unhideWhenUsed/>
+    <w:qFormat/>
+    <w:rsid w:val="00CA7050"/>
+    <w:pPr>
+      <w:spacing w:after="200" w:line="240" w:lineRule="auto"/>
+    </w:pPr>
+    <w:rPr>
+      <w:i/>
+      <w:iCs/>
+      <w:sz w:val="20"/>
+      <w:szCs w:val="18"/>
+    </w:rPr>
+  </w:style>
+  <w:style w:type="paragraph" w:styleId="TableofFigures">
+    <w:name w:val="table of figures"/>
+    <w:basedOn w:val="Normal"/>
+    <w:next w:val="Normal"/>
+    <w:uiPriority w:val="99"/>
+    <w:unhideWhenUsed/>
+    <w:rsid w:val="00E97FEE"/>
+    <w:pPr>
+      <w:spacing w:after="0"/>
+    </w:pPr>
+  </w:style>
+  <w:style w:type="character" w:styleId="Hyperlink">
+    <w:name w:val="Hyperlink"/>
+    <w:basedOn w:val="DefaultParagraphFont"/>
+    <w:uiPriority w:val="99"/>
+    <w:unhideWhenUsed/>
+    <w:rsid w:val="00E97FEE"/>
+    <w:rPr>
+      <w:color w:val="467886" w:themeColor="hyperlink"/>
+      <w:u w:val="single"/>
+    </w:rPr>
   </w:style>
 </w:styles>
 </file>
@@ -4163,40 +6745,6 @@
     <b:RefOrder>3</b:RefOrder>
   </b:Source>
   <b:Source>
-    <b:Tag>wiki_mysql</b:Tag>
-    <b:SourceType>DocumentFromInternetSite</b:SourceType>
-    <b:Guid>{B0B2A880-89F2-494F-8645-4F13C13FC3E3}</b:Guid>
-    <b:Author>
-      <b:Author>
-        <b:Corporate>Wikipedia contributors</b:Corporate>
-      </b:Author>
-    </b:Author>
-    <b:Title>MySQL</b:Title>
-    <b:InternetSiteTitle>Wikipedia</b:InternetSiteTitle>
-    <b:YearAccessed>2026</b:YearAccessed>
-    <b:MonthAccessed>02</b:MonthAccessed>
-    <b:DayAccessed>02</b:DayAccessed>
-    <b:URL>https://sk.wikipedia.org/wiki/MySQL</b:URL>
-    <b:RefOrder>4</b:RefOrder>
-  </b:Source>
-  <b:Source>
-    <b:Tag>wiki_oauth</b:Tag>
-    <b:SourceType>DocumentFromInternetSite</b:SourceType>
-    <b:Guid>{48B84627-C864-4C13-86D0-8541C7E010B6}</b:Guid>
-    <b:Title>OAuth</b:Title>
-    <b:InternetSiteTitle>Wikipedia</b:InternetSiteTitle>
-    <b:YearAccessed>2026</b:YearAccessed>
-    <b:MonthAccessed>02</b:MonthAccessed>
-    <b:DayAccessed>02</b:DayAccessed>
-    <b:URL>https://en.wikipedia.org/wiki/OAuth</b:URL>
-    <b:Author>
-      <b:Author>
-        <b:Corporate>Wikipedia contributors</b:Corporate>
-      </b:Author>
-    </b:Author>
-    <b:RefOrder>6</b:RefOrder>
-  </b:Source>
-  <b:Source>
     <b:Tag>wiki_git</b:Tag>
     <b:SourceType>DocumentFromInternetSite</b:SourceType>
     <b:Guid>{3FA8AF3B-B21C-40E4-8265-B2DA0C52A28A}</b:Guid>
@@ -4212,23 +6760,6 @@
     <b:DayAccessed>02</b:DayAccessed>
     <b:URL>https://en.wikipedia.org/wiki/Git</b:URL>
     <b:RefOrder>7</b:RefOrder>
-  </b:Source>
-  <b:Source>
-    <b:Tag>wiki_bouncycastle</b:Tag>
-    <b:SourceType>DocumentFromInternetSite</b:SourceType>
-    <b:Guid>{6A5720B5-C891-440F-864B-13268DFDA595}</b:Guid>
-    <b:Author>
-      <b:Author>
-        <b:Corporate>Wikipedia contributors</b:Corporate>
-      </b:Author>
-    </b:Author>
-    <b:Title>Bouncy Castle (cryptography)</b:Title>
-    <b:InternetSiteTitle>Wikipedia</b:InternetSiteTitle>
-    <b:YearAccessed>2026</b:YearAccessed>
-    <b:MonthAccessed>02</b:MonthAccessed>
-    <b:DayAccessed>02</b:DayAccessed>
-    <b:URL>https://en.wikipedia.org/wiki/Bouncy_Castle_(cryptography)</b:URL>
-    <b:RefOrder>8</b:RefOrder>
   </b:Source>
   <b:Source>
     <b:Tag>wiki_api</b:Tag>
@@ -4248,27 +6779,78 @@
     <b:RefOrder>5</b:RefOrder>
   </b:Source>
   <b:Source>
-    <b:Tag>wiki_blockchain</b:Tag>
+    <b:Tag>oauth_2</b:Tag>
     <b:SourceType>DocumentFromInternetSite</b:SourceType>
-    <b:Guid>{CAC6714A-5718-4B3B-89B4-6D555F923A3A}</b:Guid>
-    <b:Title>Blockchain</b:Title>
-    <b:InternetSiteTitle>Wikipedia</b:InternetSiteTitle>
+    <b:Guid>{4D67EE98-056A-4DF5-B744-B65C718AF8AB}</b:Guid>
+    <b:Title>OAuth 2.0</b:Title>
+    <b:InternetSiteTitle>OAuth.net</b:InternetSiteTitle>
     <b:YearAccessed>2026</b:YearAccessed>
     <b:MonthAccessed>02</b:MonthAccessed>
     <b:DayAccessed>02</b:DayAccessed>
-    <b:URL>https://sk.wikipedia.org/wiki/Blockchain</b:URL>
+    <b:URL>https://oauth.net/2/</b:URL>
     <b:Author>
       <b:Author>
-        <b:Corporate>Wikipedia contributors</b:Corporate>
+        <b:Corporate>OAuth</b:Corporate>
       </b:Author>
     </b:Author>
+    <b:RefOrder>6</b:RefOrder>
+  </b:Source>
+  <b:Source>
+    <b:Tag>bouncycastle_about</b:Tag>
+    <b:SourceType>DocumentFromInternetSite</b:SourceType>
+    <b:Guid>{A56C8C34-496A-42F8-A6C1-95E3CB05AB31}</b:Guid>
+    <b:Author>
+      <b:Author>
+        <b:Corporate>Bouncy Castle Inc.</b:Corporate>
+      </b:Author>
+    </b:Author>
+    <b:Title>About Bouncy Castle</b:Title>
+    <b:InternetSiteTitle>Bouncy Castle</b:InternetSiteTitle>
+    <b:YearAccessed>2026</b:YearAccessed>
+    <b:MonthAccessed>02</b:MonthAccessed>
+    <b:DayAccessed>02</b:DayAccessed>
+    <b:URL>https://www.bouncycastle.org/about/</b:URL>
+    <b:RefOrder>8</b:RefOrder>
+  </b:Source>
+  <b:Source>
+    <b:Tag>ibm_blockchain</b:Tag>
+    <b:SourceType>DocumentFromInternetSite</b:SourceType>
+    <b:Guid>{7F759DEB-F486-4298-98F6-938AD6A29B84}</b:Guid>
+    <b:Author>
+      <b:Author>
+        <b:Corporate>IBM Corporation</b:Corporate>
+      </b:Author>
+    </b:Author>
+    <b:Title>What is blockchain?</b:Title>
+    <b:InternetSiteTitle>IBM Think</b:InternetSiteTitle>
+    <b:YearAccessed>2026</b:YearAccessed>
+    <b:MonthAccessed>02</b:MonthAccessed>
+    <b:DayAccessed>02</b:DayAccessed>
+    <b:URL>https://www.ibm.com/think/topics/blockchain</b:URL>
     <b:RefOrder>9</b:RefOrder>
+  </b:Source>
+  <b:Source>
+    <b:Tag>oracle_mysql</b:Tag>
+    <b:SourceType>DocumentFromInternetSite</b:SourceType>
+    <b:Guid>{DB118A1F-891D-47C2-9DF4-B3AA63732BEE}</b:Guid>
+    <b:Author>
+      <b:Author>
+        <b:Corporate>Oracle Corporation</b:Corporate>
+      </b:Author>
+    </b:Author>
+    <b:Title>MySQL 8.4 Reference Manual: What is MySQL?</b:Title>
+    <b:InternetSiteTitle>MySQL Reference Manual</b:InternetSiteTitle>
+    <b:YearAccessed>2026</b:YearAccessed>
+    <b:MonthAccessed>02</b:MonthAccessed>
+    <b:DayAccessed>02</b:DayAccessed>
+    <b:URL>https://dev.mysql.com/doc/refman/8.4/en/what-is-mysql.html</b:URL>
+    <b:RefOrder>4</b:RefOrder>
   </b:Source>
 </b:Sources>
 </file>
 
 <file path=customXml/itemProps1.xml><?xml version="1.0" encoding="utf-8"?>
-<ds:datastoreItem xmlns:ds="http://schemas.openxmlformats.org/officeDocument/2006/customXml" ds:itemID="{4C8074E8-EF70-4DF6-948A-40815BE6AB5B}">
+<ds:datastoreItem xmlns:ds="http://schemas.openxmlformats.org/officeDocument/2006/customXml" ds:itemID="{0FA63E3D-E966-4020-A299-432FE7D70BB0}">
   <ds:schemaRefs>
     <ds:schemaRef ds:uri="http://schemas.openxmlformats.org/officeDocument/2006/bibliography"/>
   </ds:schemaRefs>

</xml_diff>

<commit_message>
- Renamed: UserEntity.cs to User.cs - Renamed: InvitationCodeEntity.cs to InvitationCode.cs - Renamed: RefreshTokenEntity.cs to RefreshToken.cs - Renamed: TwoFactorAuthEntity.cs to TotpCredential.cs - Renamed: TwoFactorAuthRepository.cs to TotpCredentialRepository.cs - Renamed: UserType.cs to UserRole.cs - Updated: Documentation.docx - Updated: Repository method names
</commit_message>
<xml_diff>
--- a/docs/Documentation.docx
+++ b/docs/Documentation.docx
@@ -444,7 +444,7 @@
         <w:sectPr>
           <w:footerReference w:type="default" r:id="rId9"/>
           <w:pgSz w:w="11906" w:h="16838"/>
-          <w:pgMar w:top="1418" w:right="1418" w:bottom="1418" w:left="1418" w:header="850" w:footer="850" w:gutter="0"/>
+          <w:pgMar w:top="1418" w:right="1418" w:bottom="1418" w:left="1985" w:header="851" w:footer="851" w:gutter="0"/>
           <w:cols w:space="708"/>
           <w:vAlign w:val="both"/>
           <w:docGrid w:linePitch="360"/>
@@ -1307,7 +1307,7 @@
         </w:rPr>
         <w:sectPr>
           <w:pgSz w:w="11906" w:h="16838"/>
-          <w:pgMar w:top="1418" w:right="1418" w:bottom="1418" w:left="1701" w:header="709" w:footer="709" w:gutter="0"/>
+          <w:pgMar w:top="1418" w:right="1418" w:bottom="1418" w:left="1985" w:header="709" w:footer="709" w:gutter="0"/>
           <w:cols w:space="708"/>
           <w:docGrid w:linePitch="360"/>
         </w:sectPr>
@@ -1504,7 +1504,7 @@
         </w:rPr>
         <w:sectPr>
           <w:pgSz w:w="11906" w:h="16838"/>
-          <w:pgMar w:top="1418" w:right="1418" w:bottom="1418" w:left="1701" w:header="850" w:footer="850" w:gutter="0"/>
+          <w:pgMar w:top="1418" w:right="1418" w:bottom="1418" w:left="1985" w:header="850" w:footer="850" w:gutter="0"/>
           <w:cols w:space="708"/>
           <w:vAlign w:val="center"/>
           <w:docGrid w:linePitch="360"/>
@@ -8889,27 +8889,14 @@
                             <w:r>
                               <w:t xml:space="preserve">Obrázok </w:t>
                             </w:r>
-                            <w:r>
-                              <w:fldChar w:fldCharType="begin"/>
-                            </w:r>
-                            <w:r>
-                              <w:instrText xml:space="preserve"> SEQ Obrázok \* ARABIC </w:instrText>
-                            </w:r>
-                            <w:r>
-                              <w:fldChar w:fldCharType="separate"/>
-                            </w:r>
-                            <w:r>
-                              <w:rPr>
-                                <w:noProof/>
-                              </w:rPr>
-                              <w:t>1</w:t>
-                            </w:r>
-                            <w:r>
-                              <w:rPr>
-                                <w:noProof/>
-                              </w:rPr>
-                              <w:fldChar w:fldCharType="end"/>
-                            </w:r>
+                            <w:fldSimple w:instr=" SEQ Obrázok \* ARABIC ">
+                              <w:r>
+                                <w:rPr>
+                                  <w:noProof/>
+                                </w:rPr>
+                                <w:t>1</w:t>
+                              </w:r>
+                            </w:fldSimple>
                             <w:r>
                               <w:t xml:space="preserve"> </w:t>
                             </w:r>
@@ -8955,27 +8942,14 @@
                       <w:r>
                         <w:t xml:space="preserve">Obrázok </w:t>
                       </w:r>
-                      <w:r>
-                        <w:fldChar w:fldCharType="begin"/>
-                      </w:r>
-                      <w:r>
-                        <w:instrText xml:space="preserve"> SEQ Obrázok \* ARABIC </w:instrText>
-                      </w:r>
-                      <w:r>
-                        <w:fldChar w:fldCharType="separate"/>
-                      </w:r>
-                      <w:r>
-                        <w:rPr>
-                          <w:noProof/>
-                        </w:rPr>
-                        <w:t>1</w:t>
-                      </w:r>
-                      <w:r>
-                        <w:rPr>
-                          <w:noProof/>
-                        </w:rPr>
-                        <w:fldChar w:fldCharType="end"/>
-                      </w:r>
+                      <w:fldSimple w:instr=" SEQ Obrázok \* ARABIC ">
+                        <w:r>
+                          <w:rPr>
+                            <w:noProof/>
+                          </w:rPr>
+                          <w:t>1</w:t>
+                        </w:r>
+                      </w:fldSimple>
                       <w:r>
                         <w:t xml:space="preserve"> </w:t>
                       </w:r>
@@ -9153,27 +9127,14 @@
                             <w:r>
                               <w:t xml:space="preserve">Obrázok </w:t>
                             </w:r>
-                            <w:r>
-                              <w:fldChar w:fldCharType="begin"/>
-                            </w:r>
-                            <w:r>
-                              <w:instrText xml:space="preserve"> SEQ Obrázok \* ARABIC </w:instrText>
-                            </w:r>
-                            <w:r>
-                              <w:fldChar w:fldCharType="separate"/>
-                            </w:r>
-                            <w:r>
-                              <w:rPr>
-                                <w:noProof/>
-                              </w:rPr>
-                              <w:t>2</w:t>
-                            </w:r>
-                            <w:r>
-                              <w:rPr>
-                                <w:noProof/>
-                              </w:rPr>
-                              <w:fldChar w:fldCharType="end"/>
-                            </w:r>
+                            <w:fldSimple w:instr=" SEQ Obrázok \* ARABIC ">
+                              <w:r>
+                                <w:rPr>
+                                  <w:noProof/>
+                                </w:rPr>
+                                <w:t>2</w:t>
+                              </w:r>
+                            </w:fldSimple>
                             <w:r>
                               <w:t xml:space="preserve"> </w:t>
                             </w:r>
@@ -9215,27 +9176,14 @@
                       <w:r>
                         <w:t xml:space="preserve">Obrázok </w:t>
                       </w:r>
-                      <w:r>
-                        <w:fldChar w:fldCharType="begin"/>
-                      </w:r>
-                      <w:r>
-                        <w:instrText xml:space="preserve"> SEQ Obrázok \* ARABIC </w:instrText>
-                      </w:r>
-                      <w:r>
-                        <w:fldChar w:fldCharType="separate"/>
-                      </w:r>
-                      <w:r>
-                        <w:rPr>
-                          <w:noProof/>
-                        </w:rPr>
-                        <w:t>2</w:t>
-                      </w:r>
-                      <w:r>
-                        <w:rPr>
-                          <w:noProof/>
-                        </w:rPr>
-                        <w:fldChar w:fldCharType="end"/>
-                      </w:r>
+                      <w:fldSimple w:instr=" SEQ Obrázok \* ARABIC ">
+                        <w:r>
+                          <w:rPr>
+                            <w:noProof/>
+                          </w:rPr>
+                          <w:t>2</w:t>
+                        </w:r>
+                      </w:fldSimple>
                       <w:r>
                         <w:t xml:space="preserve"> </w:t>
                       </w:r>
@@ -9375,27 +9323,14 @@
                             <w:r>
                               <w:t xml:space="preserve">Obrázok </w:t>
                             </w:r>
-                            <w:r>
-                              <w:fldChar w:fldCharType="begin"/>
-                            </w:r>
-                            <w:r>
-                              <w:instrText xml:space="preserve"> SEQ Obrázok \* ARABIC </w:instrText>
-                            </w:r>
-                            <w:r>
-                              <w:fldChar w:fldCharType="separate"/>
-                            </w:r>
-                            <w:r>
-                              <w:rPr>
-                                <w:noProof/>
-                              </w:rPr>
-                              <w:t>3</w:t>
-                            </w:r>
-                            <w:r>
-                              <w:rPr>
-                                <w:noProof/>
-                              </w:rPr>
-                              <w:fldChar w:fldCharType="end"/>
-                            </w:r>
+                            <w:fldSimple w:instr=" SEQ Obrázok \* ARABIC ">
+                              <w:r>
+                                <w:rPr>
+                                  <w:noProof/>
+                                </w:rPr>
+                                <w:t>3</w:t>
+                              </w:r>
+                            </w:fldSimple>
                             <w:r>
                               <w:t xml:space="preserve"> </w:t>
                             </w:r>
@@ -9442,27 +9377,14 @@
                       <w:r>
                         <w:t xml:space="preserve">Obrázok </w:t>
                       </w:r>
-                      <w:r>
-                        <w:fldChar w:fldCharType="begin"/>
-                      </w:r>
-                      <w:r>
-                        <w:instrText xml:space="preserve"> SEQ Obrázok \* ARABIC </w:instrText>
-                      </w:r>
-                      <w:r>
-                        <w:fldChar w:fldCharType="separate"/>
-                      </w:r>
-                      <w:r>
-                        <w:rPr>
-                          <w:noProof/>
-                        </w:rPr>
-                        <w:t>3</w:t>
-                      </w:r>
-                      <w:r>
-                        <w:rPr>
-                          <w:noProof/>
-                        </w:rPr>
-                        <w:fldChar w:fldCharType="end"/>
-                      </w:r>
+                      <w:fldSimple w:instr=" SEQ Obrázok \* ARABIC ">
+                        <w:r>
+                          <w:rPr>
+                            <w:noProof/>
+                          </w:rPr>
+                          <w:t>3</w:t>
+                        </w:r>
+                      </w:fldSimple>
                       <w:r>
                         <w:t xml:space="preserve"> </w:t>
                       </w:r>

</xml_diff>

<commit_message>
- Added: ActivityLogDto.cs - Added: ActivityLogView.axaml - Updated: ActivityActions
</commit_message>
<xml_diff>
--- a/docs/Documentation.docx
+++ b/docs/Documentation.docx
@@ -3206,24 +3206,14 @@
                             <w:r>
                               <w:t xml:space="preserve">Obrázok </w:t>
                             </w:r>
-                            <w:r>
-                              <w:fldChar w:fldCharType="begin"/>
-                            </w:r>
-                            <w:r>
-                              <w:instrText xml:space="preserve"> SEQ Obrázok \* ARABIC </w:instrText>
-                            </w:r>
-                            <w:r>
-                              <w:fldChar w:fldCharType="separate"/>
-                            </w:r>
-                            <w:r>
-                              <w:rPr>
-                                <w:noProof/>
-                              </w:rPr>
-                              <w:t>1</w:t>
-                            </w:r>
-                            <w:r>
-                              <w:fldChar w:fldCharType="end"/>
-                            </w:r>
+                            <w:fldSimple w:instr=" SEQ Obrázok \* ARABIC ">
+                              <w:r>
+                                <w:rPr>
+                                  <w:noProof/>
+                                </w:rPr>
+                                <w:t>1</w:t>
+                              </w:r>
+                            </w:fldSimple>
                             <w:r>
                               <w:rPr>
                                 <w:noProof/>
@@ -3244,6 +3234,7 @@
                                 <w:id w:val="1952515280"/>
                                 <w:citation/>
                               </w:sdtPr>
+                              <w:sdtEndPr/>
                               <w:sdtContent>
                                 <w:r>
                                   <w:rPr>
@@ -3322,24 +3313,14 @@
                       <w:r>
                         <w:t xml:space="preserve">Obrázok </w:t>
                       </w:r>
-                      <w:r>
-                        <w:fldChar w:fldCharType="begin"/>
-                      </w:r>
-                      <w:r>
-                        <w:instrText xml:space="preserve"> SEQ Obrázok \* ARABIC </w:instrText>
-                      </w:r>
-                      <w:r>
-                        <w:fldChar w:fldCharType="separate"/>
-                      </w:r>
-                      <w:r>
-                        <w:rPr>
-                          <w:noProof/>
-                        </w:rPr>
-                        <w:t>1</w:t>
-                      </w:r>
-                      <w:r>
-                        <w:fldChar w:fldCharType="end"/>
-                      </w:r>
+                      <w:fldSimple w:instr=" SEQ Obrázok \* ARABIC ">
+                        <w:r>
+                          <w:rPr>
+                            <w:noProof/>
+                          </w:rPr>
+                          <w:t>1</w:t>
+                        </w:r>
+                      </w:fldSimple>
                       <w:r>
                         <w:rPr>
                           <w:noProof/>
@@ -3360,6 +3341,7 @@
                           <w:id w:val="1952515280"/>
                           <w:citation/>
                         </w:sdtPr>
+                        <w:sdtEndPr/>
                         <w:sdtContent>
                           <w:r>
                             <w:rPr>
@@ -3412,6 +3394,9 @@
         </mc:AlternateContent>
       </w:r>
       <w:r>
+        <w:rPr>
+          <w:noProof/>
+        </w:rPr>
         <w:drawing>
           <wp:anchor distT="0" distB="0" distL="114300" distR="114300" simplePos="0" relativeHeight="251673600" behindDoc="1" locked="0" layoutInCell="1" allowOverlap="1" wp14:anchorId="5B75F34D" wp14:editId="31BAFA25">
             <wp:simplePos x="0" y="0"/>
@@ -3769,24 +3754,14 @@
                             <w:r>
                               <w:t xml:space="preserve">Obrázok </w:t>
                             </w:r>
-                            <w:r>
-                              <w:fldChar w:fldCharType="begin"/>
-                            </w:r>
-                            <w:r>
-                              <w:instrText xml:space="preserve"> SEQ Obrázok \* ARABIC </w:instrText>
-                            </w:r>
-                            <w:r>
-                              <w:fldChar w:fldCharType="separate"/>
-                            </w:r>
-                            <w:r>
-                              <w:rPr>
-                                <w:noProof/>
-                              </w:rPr>
-                              <w:t>2</w:t>
-                            </w:r>
-                            <w:r>
-                              <w:fldChar w:fldCharType="end"/>
-                            </w:r>
+                            <w:fldSimple w:instr=" SEQ Obrázok \* ARABIC ">
+                              <w:r>
+                                <w:rPr>
+                                  <w:noProof/>
+                                </w:rPr>
+                                <w:t>2</w:t>
+                              </w:r>
+                            </w:fldSimple>
                             <w:r>
                               <w:rPr>
                                 <w:noProof/>
@@ -3807,6 +3782,7 @@
                                 <w:id w:val="-1490628947"/>
                                 <w:citation/>
                               </w:sdtPr>
+                              <w:sdtEndPr/>
                               <w:sdtContent>
                                 <w:r>
                                   <w:rPr>
@@ -3882,24 +3858,14 @@
                       <w:r>
                         <w:t xml:space="preserve">Obrázok </w:t>
                       </w:r>
-                      <w:r>
-                        <w:fldChar w:fldCharType="begin"/>
-                      </w:r>
-                      <w:r>
-                        <w:instrText xml:space="preserve"> SEQ Obrázok \* ARABIC </w:instrText>
-                      </w:r>
-                      <w:r>
-                        <w:fldChar w:fldCharType="separate"/>
-                      </w:r>
-                      <w:r>
-                        <w:rPr>
-                          <w:noProof/>
-                        </w:rPr>
-                        <w:t>2</w:t>
-                      </w:r>
-                      <w:r>
-                        <w:fldChar w:fldCharType="end"/>
-                      </w:r>
+                      <w:fldSimple w:instr=" SEQ Obrázok \* ARABIC ">
+                        <w:r>
+                          <w:rPr>
+                            <w:noProof/>
+                          </w:rPr>
+                          <w:t>2</w:t>
+                        </w:r>
+                      </w:fldSimple>
                       <w:r>
                         <w:rPr>
                           <w:noProof/>
@@ -3920,6 +3886,7 @@
                           <w:id w:val="-1490628947"/>
                           <w:citation/>
                         </w:sdtPr>
+                        <w:sdtEndPr/>
                         <w:sdtContent>
                           <w:r>
                             <w:rPr>
@@ -4150,24 +4117,14 @@
                             <w:r>
                               <w:t xml:space="preserve">Obrázok </w:t>
                             </w:r>
-                            <w:r>
-                              <w:fldChar w:fldCharType="begin"/>
-                            </w:r>
-                            <w:r>
-                              <w:instrText xml:space="preserve"> SEQ Obrázok \* ARABIC </w:instrText>
-                            </w:r>
-                            <w:r>
-                              <w:fldChar w:fldCharType="separate"/>
-                            </w:r>
-                            <w:r>
-                              <w:rPr>
-                                <w:noProof/>
-                              </w:rPr>
-                              <w:t>3</w:t>
-                            </w:r>
-                            <w:r>
-                              <w:fldChar w:fldCharType="end"/>
-                            </w:r>
+                            <w:fldSimple w:instr=" SEQ Obrázok \* ARABIC ">
+                              <w:r>
+                                <w:rPr>
+                                  <w:noProof/>
+                                </w:rPr>
+                                <w:t>3</w:t>
+                              </w:r>
+                            </w:fldSimple>
                             <w:r>
                               <w:rPr>
                                 <w:noProof/>
@@ -4188,6 +4145,7 @@
                                 <w:id w:val="-1540508033"/>
                                 <w:citation/>
                               </w:sdtPr>
+                              <w:sdtEndPr/>
                               <w:sdtContent>
                                 <w:r>
                                   <w:rPr>
@@ -4264,24 +4222,14 @@
                       <w:r>
                         <w:t xml:space="preserve">Obrázok </w:t>
                       </w:r>
-                      <w:r>
-                        <w:fldChar w:fldCharType="begin"/>
-                      </w:r>
-                      <w:r>
-                        <w:instrText xml:space="preserve"> SEQ Obrázok \* ARABIC </w:instrText>
-                      </w:r>
-                      <w:r>
-                        <w:fldChar w:fldCharType="separate"/>
-                      </w:r>
-                      <w:r>
-                        <w:rPr>
-                          <w:noProof/>
-                        </w:rPr>
-                        <w:t>3</w:t>
-                      </w:r>
-                      <w:r>
-                        <w:fldChar w:fldCharType="end"/>
-                      </w:r>
+                      <w:fldSimple w:instr=" SEQ Obrázok \* ARABIC ">
+                        <w:r>
+                          <w:rPr>
+                            <w:noProof/>
+                          </w:rPr>
+                          <w:t>3</w:t>
+                        </w:r>
+                      </w:fldSimple>
                       <w:r>
                         <w:rPr>
                           <w:noProof/>
@@ -4302,6 +4250,7 @@
                           <w:id w:val="-1540508033"/>
                           <w:citation/>
                         </w:sdtPr>
+                        <w:sdtEndPr/>
                         <w:sdtContent>
                           <w:r>
                             <w:rPr>
@@ -4652,24 +4601,14 @@
                             <w:r>
                               <w:t xml:space="preserve">Obrázok </w:t>
                             </w:r>
-                            <w:r>
-                              <w:fldChar w:fldCharType="begin"/>
-                            </w:r>
-                            <w:r>
-                              <w:instrText xml:space="preserve"> SEQ Obrázok \* ARABIC </w:instrText>
-                            </w:r>
-                            <w:r>
-                              <w:fldChar w:fldCharType="separate"/>
-                            </w:r>
-                            <w:r>
-                              <w:rPr>
-                                <w:noProof/>
-                              </w:rPr>
-                              <w:t>4</w:t>
-                            </w:r>
-                            <w:r>
-                              <w:fldChar w:fldCharType="end"/>
-                            </w:r>
+                            <w:fldSimple w:instr=" SEQ Obrázok \* ARABIC ">
+                              <w:r>
+                                <w:rPr>
+                                  <w:noProof/>
+                                </w:rPr>
+                                <w:t>4</w:t>
+                              </w:r>
+                            </w:fldSimple>
                             <w:r>
                               <w:rPr>
                                 <w:noProof/>
@@ -4690,6 +4629,7 @@
                                 <w:id w:val="2052808186"/>
                                 <w:citation/>
                               </w:sdtPr>
+                              <w:sdtEndPr/>
                               <w:sdtContent>
                                 <w:r>
                                   <w:rPr>
@@ -4765,24 +4705,14 @@
                       <w:r>
                         <w:t xml:space="preserve">Obrázok </w:t>
                       </w:r>
-                      <w:r>
-                        <w:fldChar w:fldCharType="begin"/>
-                      </w:r>
-                      <w:r>
-                        <w:instrText xml:space="preserve"> SEQ Obrázok \* ARABIC </w:instrText>
-                      </w:r>
-                      <w:r>
-                        <w:fldChar w:fldCharType="separate"/>
-                      </w:r>
-                      <w:r>
-                        <w:rPr>
-                          <w:noProof/>
-                        </w:rPr>
-                        <w:t>4</w:t>
-                      </w:r>
-                      <w:r>
-                        <w:fldChar w:fldCharType="end"/>
-                      </w:r>
+                      <w:fldSimple w:instr=" SEQ Obrázok \* ARABIC ">
+                        <w:r>
+                          <w:rPr>
+                            <w:noProof/>
+                          </w:rPr>
+                          <w:t>4</w:t>
+                        </w:r>
+                      </w:fldSimple>
                       <w:r>
                         <w:rPr>
                           <w:noProof/>
@@ -4803,6 +4733,7 @@
                           <w:id w:val="2052808186"/>
                           <w:citation/>
                         </w:sdtPr>
+                        <w:sdtEndPr/>
                         <w:sdtContent>
                           <w:r>
                             <w:rPr>
@@ -5075,24 +5006,14 @@
                             <w:r>
                               <w:t xml:space="preserve">Obrázok </w:t>
                             </w:r>
-                            <w:r>
-                              <w:fldChar w:fldCharType="begin"/>
-                            </w:r>
-                            <w:r>
-                              <w:instrText xml:space="preserve"> SEQ Obrázok \* ARABIC </w:instrText>
-                            </w:r>
-                            <w:r>
-                              <w:fldChar w:fldCharType="separate"/>
-                            </w:r>
-                            <w:r>
-                              <w:rPr>
-                                <w:noProof/>
-                              </w:rPr>
-                              <w:t>5</w:t>
-                            </w:r>
-                            <w:r>
-                              <w:fldChar w:fldCharType="end"/>
-                            </w:r>
+                            <w:fldSimple w:instr=" SEQ Obrázok \* ARABIC ">
+                              <w:r>
+                                <w:rPr>
+                                  <w:noProof/>
+                                </w:rPr>
+                                <w:t>5</w:t>
+                              </w:r>
+                            </w:fldSimple>
                             <w:r>
                               <w:rPr>
                                 <w:noProof/>
@@ -5113,6 +5034,7 @@
                                 <w:id w:val="1031301740"/>
                                 <w:citation/>
                               </w:sdtPr>
+                              <w:sdtEndPr/>
                               <w:sdtContent>
                                 <w:r>
                                   <w:rPr>
@@ -5187,24 +5109,14 @@
                       <w:r>
                         <w:t xml:space="preserve">Obrázok </w:t>
                       </w:r>
-                      <w:r>
-                        <w:fldChar w:fldCharType="begin"/>
-                      </w:r>
-                      <w:r>
-                        <w:instrText xml:space="preserve"> SEQ Obrázok \* ARABIC </w:instrText>
-                      </w:r>
-                      <w:r>
-                        <w:fldChar w:fldCharType="separate"/>
-                      </w:r>
-                      <w:r>
-                        <w:rPr>
-                          <w:noProof/>
-                        </w:rPr>
-                        <w:t>5</w:t>
-                      </w:r>
-                      <w:r>
-                        <w:fldChar w:fldCharType="end"/>
-                      </w:r>
+                      <w:fldSimple w:instr=" SEQ Obrázok \* ARABIC ">
+                        <w:r>
+                          <w:rPr>
+                            <w:noProof/>
+                          </w:rPr>
+                          <w:t>5</w:t>
+                        </w:r>
+                      </w:fldSimple>
                       <w:r>
                         <w:rPr>
                           <w:noProof/>
@@ -5225,6 +5137,7 @@
                           <w:id w:val="1031301740"/>
                           <w:citation/>
                         </w:sdtPr>
+                        <w:sdtEndPr/>
                         <w:sdtContent>
                           <w:r>
                             <w:rPr>
@@ -5713,6 +5626,9 @@
         <w:ind w:firstLine="0"/>
       </w:pPr>
       <w:r>
+        <w:rPr>
+          <w:noProof/>
+        </w:rPr>
         <w:drawing>
           <wp:anchor distT="0" distB="0" distL="114300" distR="114300" simplePos="0" relativeHeight="251686912" behindDoc="0" locked="0" layoutInCell="1" allowOverlap="1" wp14:anchorId="60FA9AA1" wp14:editId="659F5598">
             <wp:simplePos x="0" y="0"/>
@@ -5977,15 +5893,12 @@
         <w:ind w:firstLine="0"/>
       </w:pPr>
       <w:r>
-        <w:rPr>
-          <w:noProof/>
-        </w:rPr>
         <w:lastRenderedPageBreak/>
         <w:drawing>
-          <wp:inline distT="0" distB="0" distL="0" distR="0" wp14:anchorId="65AD586F" wp14:editId="5862F1CF">
-            <wp:extent cx="5001260" cy="1828800"/>
-            <wp:effectExtent l="0" t="0" r="8890" b="0"/>
-            <wp:docPr id="39" name="Picture 39"/>
+          <wp:inline distT="0" distB="0" distL="0" distR="0" wp14:anchorId="3714F553" wp14:editId="3A14387C">
+            <wp:extent cx="5001323" cy="2333951"/>
+            <wp:effectExtent l="0" t="0" r="0" b="9525"/>
+            <wp:docPr id="3" name="Picture 3"/>
             <wp:cNvGraphicFramePr>
               <a:graphicFrameLocks xmlns:a="http://schemas.openxmlformats.org/drawingml/2006/main" noChangeAspect="1"/>
             </wp:cNvGraphicFramePr>
@@ -5993,33 +5906,23 @@
               <a:graphicData uri="http://schemas.openxmlformats.org/drawingml/2006/picture">
                 <pic:pic xmlns:pic="http://schemas.openxmlformats.org/drawingml/2006/picture">
                   <pic:nvPicPr>
-                    <pic:cNvPr id="0" name="Picture 8"/>
-                    <pic:cNvPicPr>
-                      <a:picLocks noChangeAspect="1" noChangeArrowheads="1"/>
-                    </pic:cNvPicPr>
+                    <pic:cNvPr id="1" name=""/>
+                    <pic:cNvPicPr/>
                   </pic:nvPicPr>
                   <pic:blipFill>
-                    <a:blip r:embed="rId19">
-                      <a:extLst>
-                        <a:ext uri="{28A0092B-C50C-407E-A947-70E740481C1C}">
-                          <a14:useLocalDpi xmlns:a14="http://schemas.microsoft.com/office/drawing/2010/main" val="0"/>
-                        </a:ext>
-                      </a:extLst>
-                    </a:blip>
-                    <a:srcRect/>
+                    <a:blip r:embed="rId19"/>
                     <a:stretch>
                       <a:fillRect/>
                     </a:stretch>
                   </pic:blipFill>
-                  <pic:spPr bwMode="auto">
+                  <pic:spPr>
                     <a:xfrm>
                       <a:off x="0" y="0"/>
-                      <a:ext cx="5001260" cy="1828800"/>
+                      <a:ext cx="5001323" cy="2333951"/>
                     </a:xfrm>
                     <a:prstGeom prst="rect">
                       <a:avLst/>
                     </a:prstGeom>
-                    <a:noFill/>
                   </pic:spPr>
                 </pic:pic>
               </a:graphicData>
@@ -7244,6 +7147,7 @@
   <w:style w:type="character" w:default="1" w:styleId="DefaultParagraphFont">
     <w:name w:val="Default Paragraph Font"/>
     <w:uiPriority w:val="1"/>
+    <w:semiHidden/>
     <w:unhideWhenUsed/>
   </w:style>
   <w:style w:type="table" w:default="1" w:styleId="TableNormal">

</xml_diff>